<commit_message>
Started building the appointmnet module
</commit_message>
<xml_diff>
--- a/Astracare (SRS).docx
+++ b/Astracare (SRS).docx
@@ -11,23 +11,13 @@
           <w:lang w:val="en-US"/>
         </w:rPr>
       </w:pPr>
-      <w:proofErr w:type="spellStart"/>
       <w:r>
         <w:rPr>
           <w:sz w:val="48"/>
           <w:szCs w:val="48"/>
           <w:lang w:val="en-US"/>
         </w:rPr>
-        <w:t>Astracare</w:t>
-      </w:r>
-      <w:proofErr w:type="spellEnd"/>
-      <w:r>
-        <w:rPr>
-          <w:sz w:val="48"/>
-          <w:szCs w:val="48"/>
-          <w:lang w:val="en-US"/>
-        </w:rPr>
-        <w:t>- Hospital</w:t>
+        <w:t>Astracare- Hospital</w:t>
       </w:r>
     </w:p>
     <w:p>
@@ -51,18 +41,8 @@
           <w:szCs w:val="36"/>
           <w:lang w:val="en-US"/>
         </w:rPr>
-        <w:t>Software requirement specification (SRS</w:t>
-      </w:r>
-      <w:proofErr w:type="gramStart"/>
-      <w:r>
-        <w:rPr>
-          <w:sz w:val="36"/>
-          <w:szCs w:val="36"/>
-          <w:lang w:val="en-US"/>
-        </w:rPr>
-        <w:t>):-</w:t>
-      </w:r>
-      <w:proofErr w:type="gramEnd"/>
+        <w:t>Software requirement specification (SRS):-</w:t>
+      </w:r>
     </w:p>
     <w:p>
       <w:pPr>
@@ -95,23 +75,22 @@
           <w:sz w:val="36"/>
           <w:szCs w:val="36"/>
         </w:rPr>
-        <w:t xml:space="preserve">The </w:t>
-      </w:r>
-      <w:proofErr w:type="spellStart"/>
-      <w:r>
+        <w:t>The AstraCare Hospital Management System is a web-based application developed using the MERN stack (MongoDB, Express.js, React.js, Node.js). The system is designed to digitize and streamline hospital operations such as patient registration, appointment scheduling, doctor management, diagnosis recording, prescription handling, and medical report management.</w:t>
+      </w:r>
+    </w:p>
+    <w:p>
+      <w:pPr>
         <w:rPr>
           <w:sz w:val="36"/>
           <w:szCs w:val="36"/>
         </w:rPr>
-        <w:t>AstraCare</w:t>
-      </w:r>
-      <w:proofErr w:type="spellEnd"/>
+      </w:pPr>
       <w:r>
         <w:rPr>
           <w:sz w:val="36"/>
           <w:szCs w:val="36"/>
         </w:rPr>
-        <w:t xml:space="preserve"> Hospital Management System is a web-based application developed using the MERN stack (MongoDB, Express.js, React.js, Node.js). The system is designed to digitize and streamline hospital operations such as patient registration, appointment scheduling, doctor management, diagnosis recording, prescription handling, and medical report management.</w:t>
+        <w:t>The primary goal of this system is to reduce manual paperwork, minimize operational errors, and improve communication between patients, doctors, staff, and administrators.</w:t>
       </w:r>
     </w:p>
     <w:p>
@@ -126,7 +105,7 @@
           <w:sz w:val="36"/>
           <w:szCs w:val="36"/>
         </w:rPr>
-        <w:t>The primary goal of this system is to reduce manual paperwork, minimize operational errors, and improve communication between patients, doctors, staff, and administrators.</w:t>
+        <w:t>This SRS document defines the functional and non-functional requirements of the system and serves as a reference for developers, testers, and stakeholders during the development lifecycle.</w:t>
       </w:r>
     </w:p>
     <w:p>
@@ -134,47 +113,32 @@
         <w:rPr>
           <w:sz w:val="36"/>
           <w:szCs w:val="36"/>
-        </w:rPr>
-      </w:pPr>
-      <w:r>
+          <w:lang w:val="en-US"/>
+        </w:rPr>
+      </w:pPr>
+    </w:p>
+    <w:p>
+      <w:pPr>
         <w:rPr>
           <w:sz w:val="36"/>
           <w:szCs w:val="36"/>
-        </w:rPr>
-        <w:t>This SRS document defines the functional and non-functional requirements of the system and serves as a reference for developers, testers, and stakeholders during the development lifecycle.</w:t>
-      </w:r>
-    </w:p>
-    <w:p>
-      <w:pPr>
+          <w:lang w:val="en-US"/>
+        </w:rPr>
+      </w:pPr>
+      <w:r>
         <w:rPr>
           <w:sz w:val="36"/>
           <w:szCs w:val="36"/>
           <w:lang w:val="en-US"/>
         </w:rPr>
-      </w:pPr>
-    </w:p>
-    <w:p>
-      <w:pPr>
+        <w:br/>
+      </w:r>
+      <w:r>
         <w:rPr>
           <w:sz w:val="36"/>
           <w:szCs w:val="36"/>
           <w:lang w:val="en-US"/>
         </w:rPr>
-      </w:pPr>
-      <w:r>
-        <w:rPr>
-          <w:sz w:val="36"/>
-          <w:szCs w:val="36"/>
-          <w:lang w:val="en-US"/>
-        </w:rPr>
-        <w:br/>
-      </w:r>
-      <w:r>
-        <w:rPr>
-          <w:sz w:val="36"/>
-          <w:szCs w:val="36"/>
-          <w:lang w:val="en-US"/>
-        </w:rPr>
         <w:t>Purpose-</w:t>
       </w:r>
     </w:p>
@@ -186,29 +150,12 @@
           <w:szCs w:val="28"/>
         </w:rPr>
       </w:pPr>
-      <w:proofErr w:type="spellStart"/>
-      <w:r>
-        <w:rPr>
-          <w:sz w:val="28"/>
-          <w:szCs w:val="28"/>
-        </w:rPr>
-        <w:t>AstraCare</w:t>
-      </w:r>
-      <w:proofErr w:type="spellEnd"/>
-      <w:r>
-        <w:rPr>
-          <w:sz w:val="28"/>
-          <w:szCs w:val="28"/>
-        </w:rPr>
-        <w:t xml:space="preserve"> Hospital Management System is a </w:t>
-      </w:r>
-      <w:proofErr w:type="gramStart"/>
-      <w:r>
-        <w:rPr>
-          <w:sz w:val="28"/>
-          <w:szCs w:val="28"/>
-        </w:rPr>
-        <w:t>web</w:t>
+      <w:r>
+        <w:rPr>
+          <w:sz w:val="28"/>
+          <w:szCs w:val="28"/>
+        </w:rPr>
+        <w:t>AstraCare Hospital Management System is a web</w:t>
       </w:r>
       <w:r>
         <w:rPr>
@@ -222,31 +169,7 @@
           <w:sz w:val="28"/>
           <w:szCs w:val="28"/>
         </w:rPr>
-        <w:t>based</w:t>
-      </w:r>
-      <w:proofErr w:type="gramEnd"/>
-      <w:r>
-        <w:rPr>
-          <w:sz w:val="28"/>
-          <w:szCs w:val="28"/>
-        </w:rPr>
-        <w:t xml:space="preserve"> application designed for </w:t>
-      </w:r>
-      <w:proofErr w:type="spellStart"/>
-      <w:r>
-        <w:rPr>
-          <w:sz w:val="28"/>
-          <w:szCs w:val="28"/>
-        </w:rPr>
-        <w:t>AstraCare</w:t>
-      </w:r>
-      <w:proofErr w:type="spellEnd"/>
-      <w:r>
-        <w:rPr>
-          <w:sz w:val="28"/>
-          <w:szCs w:val="28"/>
-        </w:rPr>
-        <w:t xml:space="preserve"> Hospital to streamline communication and coordination between hospital staff and patients. The system aims to reduce manual errors, improve data accuracy, and eliminate operational </w:t>
+        <w:t xml:space="preserve">based application designed for AstraCare Hospital to streamline communication and coordination between hospital staff and patients. The system aims to reduce manual errors, improve data accuracy, and eliminate operational </w:t>
       </w:r>
       <w:r>
         <w:rPr>
@@ -294,31 +217,7 @@
           <w:sz w:val="28"/>
           <w:szCs w:val="28"/>
         </w:rPr>
-        <w:t xml:space="preserve">The </w:t>
-      </w:r>
-      <w:proofErr w:type="spellStart"/>
-      <w:r>
-        <w:rPr>
-          <w:sz w:val="28"/>
-          <w:szCs w:val="28"/>
-        </w:rPr>
-        <w:t>AstraCare</w:t>
-      </w:r>
-      <w:proofErr w:type="spellEnd"/>
-      <w:r>
-        <w:rPr>
-          <w:sz w:val="28"/>
-          <w:szCs w:val="28"/>
-        </w:rPr>
-        <w:t xml:space="preserve"> Hospital Management System is a </w:t>
-      </w:r>
-      <w:proofErr w:type="gramStart"/>
-      <w:r>
-        <w:rPr>
-          <w:sz w:val="28"/>
-          <w:szCs w:val="28"/>
-        </w:rPr>
-        <w:t>web</w:t>
+        <w:t>The AstraCare Hospital Management System is a web</w:t>
       </w:r>
       <w:r>
         <w:rPr>
@@ -332,31 +231,7 @@
           <w:sz w:val="28"/>
           <w:szCs w:val="28"/>
         </w:rPr>
-        <w:t>based</w:t>
-      </w:r>
-      <w:proofErr w:type="gramEnd"/>
-      <w:r>
-        <w:rPr>
-          <w:sz w:val="28"/>
-          <w:szCs w:val="28"/>
-        </w:rPr>
-        <w:t xml:space="preserve"> application developed to digitize and streamline the internal operations of </w:t>
-      </w:r>
-      <w:proofErr w:type="spellStart"/>
-      <w:r>
-        <w:rPr>
-          <w:sz w:val="28"/>
-          <w:szCs w:val="28"/>
-        </w:rPr>
-        <w:t>AstraCare</w:t>
-      </w:r>
-      <w:proofErr w:type="spellEnd"/>
-      <w:r>
-        <w:rPr>
-          <w:sz w:val="28"/>
-          <w:szCs w:val="28"/>
-        </w:rPr>
-        <w:t xml:space="preserve"> Hospital. The system focuses on improving efficiency, accuracy, and coordination between hospital staff and patients by replacing manual record</w:t>
+        <w:t>based application developed to digitize and streamline the internal operations of AstraCare Hospital. The system focuses on improving efficiency, accuracy, and coordination between hospital staff and patients by replacing manual record</w:t>
       </w:r>
       <w:r>
         <w:rPr>
@@ -473,39 +348,7 @@
           <w:sz w:val="28"/>
           <w:szCs w:val="28"/>
         </w:rPr>
-        <w:t xml:space="preserve">The </w:t>
-      </w:r>
-      <w:proofErr w:type="spellStart"/>
-      <w:r>
-        <w:rPr>
-          <w:sz w:val="28"/>
-          <w:szCs w:val="28"/>
-        </w:rPr>
-        <w:t>AstraCare</w:t>
-      </w:r>
-      <w:proofErr w:type="spellEnd"/>
-      <w:r>
-        <w:rPr>
-          <w:sz w:val="28"/>
-          <w:szCs w:val="28"/>
-        </w:rPr>
-        <w:t xml:space="preserve"> Hospital Management System is a web-based application designed using the MERN stack (MongoDB, Express.js, React.js, Node.js). The system is initially developed and tested in a local development environment (localhost) and is intended to be deployed on cloud platforms such as Render (backend) and </w:t>
-      </w:r>
-      <w:proofErr w:type="spellStart"/>
-      <w:r>
-        <w:rPr>
-          <w:sz w:val="28"/>
-          <w:szCs w:val="28"/>
-        </w:rPr>
-        <w:t>Vercel</w:t>
-      </w:r>
-      <w:proofErr w:type="spellEnd"/>
-      <w:r>
-        <w:rPr>
-          <w:sz w:val="28"/>
-          <w:szCs w:val="28"/>
-        </w:rPr>
-        <w:t xml:space="preserve"> (frontend) for production use.</w:t>
+        <w:t>The AstraCare Hospital Management System is a web-based application designed using the MERN stack (MongoDB, Express.js, React.js, Node.js). The system is initially developed and tested in a local development environment (localhost) and is intended to be deployed on cloud platforms such as Render (backend) and Vercel (frontend) for production use.</w:t>
       </w:r>
     </w:p>
     <w:p>
@@ -1164,23 +1007,7 @@
           <w:sz w:val="28"/>
           <w:szCs w:val="28"/>
         </w:rPr>
-        <w:t xml:space="preserve">Deployment Environment: </w:t>
-      </w:r>
-      <w:proofErr w:type="spellStart"/>
-      <w:r>
-        <w:rPr>
-          <w:sz w:val="28"/>
-          <w:szCs w:val="28"/>
-        </w:rPr>
-        <w:t>Vercel</w:t>
-      </w:r>
-      <w:proofErr w:type="spellEnd"/>
-      <w:r>
-        <w:rPr>
-          <w:sz w:val="28"/>
-          <w:szCs w:val="28"/>
-        </w:rPr>
-        <w:t xml:space="preserve"> (frontend) and Render (backend)</w:t>
+        <w:t>Deployment Environment: Vercel (frontend) and Render (backend)</w:t>
       </w:r>
     </w:p>
     <w:p>
@@ -2729,23 +2556,7 @@
           <w:sz w:val="28"/>
           <w:szCs w:val="28"/>
         </w:rPr>
-        <w:t>The system shall be deployable on cloud platforms (</w:t>
-      </w:r>
-      <w:proofErr w:type="spellStart"/>
-      <w:r>
-        <w:rPr>
-          <w:sz w:val="28"/>
-          <w:szCs w:val="28"/>
-        </w:rPr>
-        <w:t>Vercel</w:t>
-      </w:r>
-      <w:proofErr w:type="spellEnd"/>
-      <w:r>
-        <w:rPr>
-          <w:sz w:val="28"/>
-          <w:szCs w:val="28"/>
-        </w:rPr>
-        <w:t xml:space="preserve">, Render). </w:t>
+        <w:t xml:space="preserve">The system shall be deployable on cloud platforms (Vercel, Render). </w:t>
       </w:r>
     </w:p>
     <w:p>
@@ -2808,22 +2619,13 @@
           <w:szCs w:val="28"/>
         </w:rPr>
       </w:pPr>
-      <w:proofErr w:type="spellStart"/>
       <w:r>
         <w:rPr>
           <w:sz w:val="28"/>
           <w:szCs w:val="28"/>
         </w:rPr>
         <w:lastRenderedPageBreak/>
-        <w:t>bcrypt</w:t>
-      </w:r>
-      <w:proofErr w:type="spellEnd"/>
-      <w:r>
-        <w:rPr>
-          <w:sz w:val="28"/>
-          <w:szCs w:val="28"/>
-        </w:rPr>
-        <w:t xml:space="preserve"> </w:t>
+        <w:t xml:space="preserve">bcrypt </w:t>
       </w:r>
     </w:p>
     <w:p>
@@ -3462,6 +3264,7 @@
       </w:pPr>
       <w:r>
         <w:rPr>
+          <w:noProof/>
           <w:sz w:val="28"/>
           <w:szCs w:val="28"/>
         </w:rPr>
@@ -3534,6 +3337,7 @@
       </w:pPr>
       <w:r>
         <w:rPr>
+          <w:noProof/>
           <w:sz w:val="28"/>
           <w:szCs w:val="28"/>
         </w:rPr>
@@ -3595,23 +3399,7 @@
           <w:sz w:val="28"/>
           <w:szCs w:val="28"/>
         </w:rPr>
-        <w:t xml:space="preserve">The Use Case Diagram of </w:t>
-      </w:r>
-      <w:proofErr w:type="spellStart"/>
-      <w:r>
-        <w:rPr>
-          <w:sz w:val="28"/>
-          <w:szCs w:val="28"/>
-        </w:rPr>
-        <w:t>AstraCare</w:t>
-      </w:r>
-      <w:proofErr w:type="spellEnd"/>
-      <w:r>
-        <w:rPr>
-          <w:sz w:val="28"/>
-          <w:szCs w:val="28"/>
-        </w:rPr>
-        <w:t xml:space="preserve"> Hospital Management System represents the interaction between different users and the system functionalities. The system includes four primary actors: Admin, Doctor, Patient, and Staff. Each actor interacts with specific functionalities such as patient registration, appointment scheduling, diagnosis management, and report handling.</w:t>
+        <w:t>The Use Case Diagram of AstraCare Hospital Management System represents the interaction between different users and the system functionalities. The system includes four primary actors: Admin, Doctor, Patient, and Staff. Each actor interacts with specific functionalities such as patient registration, appointment scheduling, diagnosis management, and report handling.</w:t>
       </w:r>
     </w:p>
     <w:p>
@@ -3680,101 +3468,42 @@
           <w:szCs w:val="28"/>
         </w:rPr>
       </w:pPr>
-      <w:proofErr w:type="spellStart"/>
-      <w:r>
-        <w:rPr>
-          <w:sz w:val="28"/>
-          <w:szCs w:val="28"/>
-        </w:rPr>
-        <w:t>const</w:t>
-      </w:r>
-      <w:proofErr w:type="spellEnd"/>
-      <w:r>
-        <w:rPr>
-          <w:sz w:val="28"/>
-          <w:szCs w:val="28"/>
-        </w:rPr>
-        <w:t xml:space="preserve"> </w:t>
-      </w:r>
-      <w:proofErr w:type="spellStart"/>
-      <w:r>
-        <w:rPr>
-          <w:sz w:val="28"/>
-          <w:szCs w:val="28"/>
-        </w:rPr>
-        <w:t>patientSchema</w:t>
-      </w:r>
-      <w:proofErr w:type="spellEnd"/>
-      <w:r>
-        <w:rPr>
-          <w:sz w:val="28"/>
-          <w:szCs w:val="28"/>
-        </w:rPr>
-        <w:t xml:space="preserve"> = new </w:t>
-      </w:r>
-      <w:proofErr w:type="spellStart"/>
-      <w:proofErr w:type="gramStart"/>
-      <w:r>
-        <w:rPr>
-          <w:sz w:val="28"/>
-          <w:szCs w:val="28"/>
-        </w:rPr>
-        <w:t>mongoose.Schema</w:t>
-      </w:r>
-      <w:proofErr w:type="spellEnd"/>
-      <w:proofErr w:type="gramEnd"/>
-      <w:r>
-        <w:rPr>
-          <w:sz w:val="28"/>
-          <w:szCs w:val="28"/>
-        </w:rPr>
-        <w:t>({</w:t>
-      </w:r>
-    </w:p>
-    <w:p>
-      <w:pPr>
-        <w:rPr>
-          <w:sz w:val="28"/>
-          <w:szCs w:val="28"/>
-        </w:rPr>
-      </w:pPr>
-      <w:r>
-        <w:rPr>
-          <w:sz w:val="28"/>
-          <w:szCs w:val="28"/>
-        </w:rPr>
-        <w:t xml:space="preserve">    </w:t>
-      </w:r>
-      <w:proofErr w:type="spellStart"/>
-      <w:r>
-        <w:rPr>
-          <w:sz w:val="28"/>
-          <w:szCs w:val="28"/>
-        </w:rPr>
-        <w:t>patientId</w:t>
-      </w:r>
-      <w:proofErr w:type="spellEnd"/>
-      <w:r>
-        <w:rPr>
-          <w:sz w:val="28"/>
-          <w:szCs w:val="28"/>
-        </w:rPr>
-        <w:t>: {</w:t>
-      </w:r>
-    </w:p>
-    <w:p>
-      <w:pPr>
-        <w:rPr>
-          <w:sz w:val="28"/>
-          <w:szCs w:val="28"/>
-        </w:rPr>
-      </w:pPr>
-      <w:r>
-        <w:rPr>
-          <w:sz w:val="28"/>
-          <w:szCs w:val="28"/>
-        </w:rPr>
-        <w:t xml:space="preserve">        type: String,</w:t>
+      <w:r>
+        <w:rPr>
+          <w:sz w:val="28"/>
+          <w:szCs w:val="28"/>
+        </w:rPr>
+        <w:t>const patientSchema = new mongoose.Schema({</w:t>
+      </w:r>
+    </w:p>
+    <w:p>
+      <w:pPr>
+        <w:rPr>
+          <w:sz w:val="28"/>
+          <w:szCs w:val="28"/>
+        </w:rPr>
+      </w:pPr>
+      <w:r>
+        <w:rPr>
+          <w:sz w:val="28"/>
+          <w:szCs w:val="28"/>
+        </w:rPr>
+        <w:t xml:space="preserve">    name: String,</w:t>
+      </w:r>
+    </w:p>
+    <w:p>
+      <w:pPr>
+        <w:rPr>
+          <w:sz w:val="28"/>
+          <w:szCs w:val="28"/>
+        </w:rPr>
+      </w:pPr>
+      <w:r>
+        <w:rPr>
+          <w:sz w:val="28"/>
+          <w:szCs w:val="28"/>
+        </w:rPr>
+        <w:t xml:space="preserve">    age: Number,</w:t>
       </w:r>
     </w:p>
     <w:p>
@@ -3790,66 +3519,6 @@
           <w:szCs w:val="28"/>
         </w:rPr>
         <w:lastRenderedPageBreak/>
-        <w:t xml:space="preserve">        unique: true</w:t>
-      </w:r>
-    </w:p>
-    <w:p>
-      <w:pPr>
-        <w:rPr>
-          <w:sz w:val="28"/>
-          <w:szCs w:val="28"/>
-        </w:rPr>
-      </w:pPr>
-      <w:r>
-        <w:rPr>
-          <w:sz w:val="28"/>
-          <w:szCs w:val="28"/>
-        </w:rPr>
-        <w:t xml:space="preserve">    },</w:t>
-      </w:r>
-    </w:p>
-    <w:p>
-      <w:pPr>
-        <w:rPr>
-          <w:sz w:val="28"/>
-          <w:szCs w:val="28"/>
-        </w:rPr>
-      </w:pPr>
-      <w:r>
-        <w:rPr>
-          <w:sz w:val="28"/>
-          <w:szCs w:val="28"/>
-        </w:rPr>
-        <w:t xml:space="preserve">    name: String,</w:t>
-      </w:r>
-    </w:p>
-    <w:p>
-      <w:pPr>
-        <w:rPr>
-          <w:sz w:val="28"/>
-          <w:szCs w:val="28"/>
-        </w:rPr>
-      </w:pPr>
-      <w:r>
-        <w:rPr>
-          <w:sz w:val="28"/>
-          <w:szCs w:val="28"/>
-        </w:rPr>
-        <w:t xml:space="preserve">    age: Number,</w:t>
-      </w:r>
-    </w:p>
-    <w:p>
-      <w:pPr>
-        <w:rPr>
-          <w:sz w:val="28"/>
-          <w:szCs w:val="28"/>
-        </w:rPr>
-      </w:pPr>
-      <w:r>
-        <w:rPr>
-          <w:sz w:val="28"/>
-          <w:szCs w:val="28"/>
-        </w:rPr>
         <w:t xml:space="preserve">    gender: String,</w:t>
       </w:r>
     </w:p>
@@ -3888,23 +3557,7 @@
           <w:sz w:val="28"/>
           <w:szCs w:val="28"/>
         </w:rPr>
-        <w:t xml:space="preserve">    </w:t>
-      </w:r>
-      <w:proofErr w:type="spellStart"/>
-      <w:r>
-        <w:rPr>
-          <w:sz w:val="28"/>
-          <w:szCs w:val="28"/>
-        </w:rPr>
-        <w:t>diseaseHistory</w:t>
-      </w:r>
-      <w:proofErr w:type="spellEnd"/>
-      <w:r>
-        <w:rPr>
-          <w:sz w:val="28"/>
-          <w:szCs w:val="28"/>
-        </w:rPr>
-        <w:t>: [</w:t>
+        <w:t xml:space="preserve">    diseaseHistory: [</w:t>
       </w:r>
     </w:p>
     <w:p>
@@ -3994,23 +3647,7 @@
           <w:sz w:val="28"/>
           <w:szCs w:val="28"/>
         </w:rPr>
-        <w:t xml:space="preserve">            </w:t>
-      </w:r>
-      <w:proofErr w:type="spellStart"/>
-      <w:r>
-        <w:rPr>
-          <w:sz w:val="28"/>
-          <w:szCs w:val="28"/>
-        </w:rPr>
-        <w:t>diagnosedOn</w:t>
-      </w:r>
-      <w:proofErr w:type="spellEnd"/>
-      <w:r>
-        <w:rPr>
-          <w:sz w:val="28"/>
-          <w:szCs w:val="28"/>
-        </w:rPr>
-        <w:t>: {</w:t>
+        <w:t xml:space="preserve">            diagnosedOn: {</w:t>
       </w:r>
     </w:p>
     <w:p>
@@ -4165,25 +3802,7 @@
           <w:szCs w:val="28"/>
           <w:lang w:val="en-US"/>
         </w:rPr>
-        <w:t xml:space="preserve">  "</w:t>
-      </w:r>
-      <w:proofErr w:type="spellStart"/>
-      <w:r>
-        <w:rPr>
-          <w:sz w:val="28"/>
-          <w:szCs w:val="28"/>
-          <w:lang w:val="en-US"/>
-        </w:rPr>
-        <w:t>doctorId</w:t>
-      </w:r>
-      <w:proofErr w:type="spellEnd"/>
-      <w:r>
-        <w:rPr>
-          <w:sz w:val="28"/>
-          <w:szCs w:val="28"/>
-          <w:lang w:val="en-US"/>
-        </w:rPr>
-        <w:t>": "D201",</w:t>
+        <w:t xml:space="preserve">  "doctorId": "D201",</w:t>
       </w:r>
     </w:p>
     <w:p>
@@ -4217,42 +3836,603 @@
           <w:szCs w:val="28"/>
           <w:lang w:val="en-US"/>
         </w:rPr>
+        <w:t xml:space="preserve">  "specialization": "Cardiologist",</w:t>
+      </w:r>
+    </w:p>
+    <w:p>
+      <w:pPr>
+        <w:rPr>
+          <w:sz w:val="28"/>
+          <w:szCs w:val="28"/>
+          <w:lang w:val="en-US"/>
+        </w:rPr>
+      </w:pPr>
+      <w:r>
+        <w:rPr>
+          <w:sz w:val="28"/>
+          <w:szCs w:val="28"/>
+          <w:lang w:val="en-US"/>
+        </w:rPr>
+        <w:t xml:space="preserve">  "experience": "8 years",</w:t>
+      </w:r>
+    </w:p>
+    <w:p>
+      <w:pPr>
+        <w:rPr>
+          <w:sz w:val="28"/>
+          <w:szCs w:val="28"/>
+          <w:lang w:val="en-US"/>
+        </w:rPr>
+      </w:pPr>
+      <w:r>
+        <w:rPr>
+          <w:sz w:val="28"/>
+          <w:szCs w:val="28"/>
+          <w:lang w:val="en-US"/>
+        </w:rPr>
+        <w:t xml:space="preserve">  "contact": "9999999999"</w:t>
+      </w:r>
+    </w:p>
+    <w:p>
+      <w:pPr>
+        <w:rPr>
+          <w:sz w:val="28"/>
+          <w:szCs w:val="28"/>
+          <w:lang w:val="en-US"/>
+        </w:rPr>
+      </w:pPr>
+      <w:r>
+        <w:rPr>
+          <w:sz w:val="28"/>
+          <w:szCs w:val="28"/>
+          <w:lang w:val="en-US"/>
+        </w:rPr>
+        <w:t>}</w:t>
+      </w:r>
+    </w:p>
+    <w:p>
+      <w:pPr>
+        <w:rPr>
+          <w:sz w:val="28"/>
+          <w:szCs w:val="28"/>
+          <w:lang w:val="en-US"/>
+        </w:rPr>
+      </w:pPr>
+    </w:p>
+    <w:p>
+      <w:pPr>
+        <w:rPr>
+          <w:sz w:val="28"/>
+          <w:szCs w:val="28"/>
+          <w:lang w:val="en-US"/>
+        </w:rPr>
+      </w:pPr>
+      <w:r>
+        <w:rPr>
+          <w:sz w:val="28"/>
+          <w:szCs w:val="28"/>
+          <w:lang w:val="en-US"/>
+        </w:rPr>
+        <w:t>Department collection-</w:t>
+      </w:r>
+      <w:r>
+        <w:rPr>
+          <w:sz w:val="28"/>
+          <w:szCs w:val="28"/>
+          <w:lang w:val="en-US"/>
+        </w:rPr>
+        <w:br/>
+      </w:r>
+      <w:r>
+        <w:rPr>
+          <w:sz w:val="28"/>
+          <w:szCs w:val="28"/>
+          <w:lang w:val="en-US"/>
+        </w:rPr>
+        <w:tab/>
+      </w:r>
+      <w:r>
+        <w:rPr>
+          <w:sz w:val="28"/>
+          <w:szCs w:val="28"/>
+          <w:lang w:val="en-US"/>
+        </w:rPr>
+        <w:tab/>
+      </w:r>
+      <w:r>
+        <w:rPr>
+          <w:sz w:val="28"/>
+          <w:szCs w:val="28"/>
+          <w:lang w:val="en-US"/>
+        </w:rPr>
+        <w:t>{</w:t>
+      </w:r>
+    </w:p>
+    <w:p>
+      <w:pPr>
+        <w:rPr>
+          <w:sz w:val="28"/>
+          <w:szCs w:val="28"/>
+          <w:lang w:val="en-US"/>
+        </w:rPr>
+      </w:pPr>
+      <w:r>
+        <w:rPr>
+          <w:sz w:val="28"/>
+          <w:szCs w:val="28"/>
+          <w:lang w:val="en-US"/>
+        </w:rPr>
+        <w:t xml:space="preserve">  "departmentId": "DEP001",</w:t>
+      </w:r>
+    </w:p>
+    <w:p>
+      <w:pPr>
+        <w:rPr>
+          <w:sz w:val="28"/>
+          <w:szCs w:val="28"/>
+          <w:lang w:val="en-US"/>
+        </w:rPr>
+      </w:pPr>
+      <w:r>
+        <w:rPr>
+          <w:sz w:val="28"/>
+          <w:szCs w:val="28"/>
+          <w:lang w:val="en-US"/>
+        </w:rPr>
+        <w:t xml:space="preserve">  "departmentName": "Cardiology",</w:t>
+      </w:r>
+    </w:p>
+    <w:p>
+      <w:pPr>
+        <w:rPr>
+          <w:sz w:val="28"/>
+          <w:szCs w:val="28"/>
+          <w:lang w:val="en-US"/>
+        </w:rPr>
+      </w:pPr>
+      <w:r>
+        <w:rPr>
+          <w:sz w:val="28"/>
+          <w:szCs w:val="28"/>
+          <w:lang w:val="en-US"/>
+        </w:rPr>
+        <w:t xml:space="preserve">  "headDoctorId": "D001",</w:t>
+      </w:r>
+    </w:p>
+    <w:p>
+      <w:pPr>
+        <w:rPr>
+          <w:sz w:val="28"/>
+          <w:szCs w:val="28"/>
+          <w:lang w:val="en-US"/>
+        </w:rPr>
+      </w:pPr>
+      <w:r>
+        <w:rPr>
+          <w:sz w:val="28"/>
+          <w:szCs w:val="28"/>
+          <w:lang w:val="en-US"/>
+        </w:rPr>
+        <w:t xml:space="preserve">  "location": "Block A - Floor 2",</w:t>
+      </w:r>
+    </w:p>
+    <w:p>
+      <w:pPr>
+        <w:rPr>
+          <w:sz w:val="28"/>
+          <w:szCs w:val="28"/>
+          <w:lang w:val="en-US"/>
+        </w:rPr>
+      </w:pPr>
+      <w:r>
+        <w:rPr>
+          <w:sz w:val="28"/>
+          <w:szCs w:val="28"/>
+          <w:lang w:val="en-US"/>
+        </w:rPr>
+        <w:t xml:space="preserve">  "contactNumber": "011-45678901",</w:t>
+      </w:r>
+    </w:p>
+    <w:p>
+      <w:pPr>
+        <w:rPr>
+          <w:sz w:val="28"/>
+          <w:szCs w:val="28"/>
+          <w:lang w:val="en-US"/>
+        </w:rPr>
+      </w:pPr>
+      <w:r>
+        <w:rPr>
+          <w:sz w:val="28"/>
+          <w:szCs w:val="28"/>
+          <w:lang w:val="en-US"/>
+        </w:rPr>
+        <w:t xml:space="preserve">  "status": "Active"</w:t>
+      </w:r>
+    </w:p>
+    <w:p>
+      <w:pPr>
+        <w:rPr>
+          <w:sz w:val="28"/>
+          <w:szCs w:val="28"/>
+          <w:lang w:val="en-US"/>
+        </w:rPr>
+      </w:pPr>
+      <w:r>
+        <w:rPr>
+          <w:sz w:val="28"/>
+          <w:szCs w:val="28"/>
+          <w:lang w:val="en-US"/>
+        </w:rPr>
+        <w:t>}</w:t>
+      </w:r>
+    </w:p>
+    <w:p>
+      <w:pPr>
+        <w:rPr>
+          <w:sz w:val="28"/>
+          <w:szCs w:val="28"/>
+          <w:lang w:val="en-US"/>
+        </w:rPr>
+      </w:pPr>
+    </w:p>
+    <w:p>
+      <w:pPr>
+        <w:rPr>
+          <w:sz w:val="28"/>
+          <w:szCs w:val="28"/>
+          <w:lang w:val="en-US"/>
+        </w:rPr>
+      </w:pPr>
+      <w:r>
+        <w:rPr>
+          <w:sz w:val="28"/>
+          <w:szCs w:val="28"/>
+          <w:lang w:val="en-US"/>
+        </w:rPr>
+        <w:t>{</w:t>
+      </w:r>
+    </w:p>
+    <w:p>
+      <w:pPr>
+        <w:rPr>
+          <w:sz w:val="28"/>
+          <w:szCs w:val="28"/>
+          <w:lang w:val="en-US"/>
+        </w:rPr>
+      </w:pPr>
+      <w:r>
+        <w:rPr>
+          <w:sz w:val="28"/>
+          <w:szCs w:val="28"/>
+          <w:lang w:val="en-US"/>
+        </w:rPr>
+        <w:t xml:space="preserve">    "prescriptionId":"PR001",</w:t>
+      </w:r>
+    </w:p>
+    <w:p>
+      <w:pPr>
+        <w:rPr>
+          <w:sz w:val="28"/>
+          <w:szCs w:val="28"/>
+          <w:lang w:val="en-US"/>
+        </w:rPr>
+      </w:pPr>
+      <w:r>
+        <w:rPr>
+          <w:sz w:val="28"/>
+          <w:szCs w:val="28"/>
+          <w:lang w:val="en-US"/>
+        </w:rPr>
+        <w:t xml:space="preserve">    "patientId":"P001",</w:t>
+      </w:r>
+    </w:p>
+    <w:p>
+      <w:pPr>
+        <w:rPr>
+          <w:sz w:val="28"/>
+          <w:szCs w:val="28"/>
+          <w:lang w:val="en-US"/>
+        </w:rPr>
+      </w:pPr>
+      <w:r>
+        <w:rPr>
+          <w:sz w:val="28"/>
+          <w:szCs w:val="28"/>
+          <w:lang w:val="en-US"/>
+        </w:rPr>
+        <w:t xml:space="preserve">    "doctorId":"D001",</w:t>
+      </w:r>
+    </w:p>
+    <w:p>
+      <w:pPr>
+        <w:rPr>
+          <w:sz w:val="28"/>
+          <w:szCs w:val="28"/>
+          <w:lang w:val="en-US"/>
+        </w:rPr>
+      </w:pPr>
+      <w:r>
+        <w:rPr>
+          <w:sz w:val="28"/>
+          <w:szCs w:val="28"/>
+          <w:lang w:val="en-US"/>
+        </w:rPr>
+        <w:t xml:space="preserve">    "diagnosisId":"DG001",</w:t>
+      </w:r>
+    </w:p>
+    <w:p>
+      <w:pPr>
+        <w:rPr>
+          <w:sz w:val="28"/>
+          <w:szCs w:val="28"/>
+          <w:lang w:val="en-US"/>
+        </w:rPr>
+      </w:pPr>
+    </w:p>
+    <w:p>
+      <w:pPr>
+        <w:rPr>
+          <w:sz w:val="28"/>
+          <w:szCs w:val="28"/>
+          <w:lang w:val="en-US"/>
+        </w:rPr>
+      </w:pPr>
+      <w:r>
+        <w:rPr>
+          <w:sz w:val="28"/>
+          <w:szCs w:val="28"/>
+          <w:lang w:val="en-US"/>
+        </w:rPr>
+        <w:t xml:space="preserve">    "medicines":[</w:t>
+      </w:r>
+    </w:p>
+    <w:p>
+      <w:pPr>
+        <w:rPr>
+          <w:sz w:val="28"/>
+          <w:szCs w:val="28"/>
+          <w:lang w:val="en-US"/>
+        </w:rPr>
+      </w:pPr>
+      <w:r>
+        <w:rPr>
+          <w:sz w:val="28"/>
+          <w:szCs w:val="28"/>
+          <w:lang w:val="en-US"/>
+        </w:rPr>
+        <w:t xml:space="preserve">        {</w:t>
+      </w:r>
+    </w:p>
+    <w:p>
+      <w:pPr>
+        <w:rPr>
+          <w:sz w:val="28"/>
+          <w:szCs w:val="28"/>
+          <w:lang w:val="en-US"/>
+        </w:rPr>
+      </w:pPr>
+      <w:r>
+        <w:rPr>
+          <w:sz w:val="28"/>
+          <w:szCs w:val="28"/>
+          <w:lang w:val="en-US"/>
+        </w:rPr>
+        <w:t xml:space="preserve">            "name":"Paracetamol",</w:t>
+      </w:r>
+    </w:p>
+    <w:p>
+      <w:pPr>
+        <w:rPr>
+          <w:sz w:val="28"/>
+          <w:szCs w:val="28"/>
+          <w:lang w:val="en-US"/>
+        </w:rPr>
+      </w:pPr>
+      <w:r>
+        <w:rPr>
+          <w:sz w:val="28"/>
+          <w:szCs w:val="28"/>
+          <w:lang w:val="en-US"/>
+        </w:rPr>
+        <w:t xml:space="preserve">            "dosage":"500 mg",</w:t>
+      </w:r>
+    </w:p>
+    <w:p>
+      <w:pPr>
+        <w:rPr>
+          <w:sz w:val="28"/>
+          <w:szCs w:val="28"/>
+          <w:lang w:val="en-US"/>
+        </w:rPr>
+      </w:pPr>
+      <w:r>
+        <w:rPr>
+          <w:sz w:val="28"/>
+          <w:szCs w:val="28"/>
+          <w:lang w:val="en-US"/>
+        </w:rPr>
+        <w:t xml:space="preserve">            "frequency":"Twice Daily",</w:t>
+      </w:r>
+    </w:p>
+    <w:p>
+      <w:pPr>
+        <w:rPr>
+          <w:sz w:val="28"/>
+          <w:szCs w:val="28"/>
+          <w:lang w:val="en-US"/>
+        </w:rPr>
+      </w:pPr>
+      <w:r>
+        <w:rPr>
+          <w:sz w:val="28"/>
+          <w:szCs w:val="28"/>
+          <w:lang w:val="en-US"/>
+        </w:rPr>
+        <w:t xml:space="preserve">            "duration":"5 Days"</w:t>
+      </w:r>
+    </w:p>
+    <w:p>
+      <w:pPr>
+        <w:rPr>
+          <w:sz w:val="28"/>
+          <w:szCs w:val="28"/>
+          <w:lang w:val="en-US"/>
+        </w:rPr>
+      </w:pPr>
+      <w:r>
+        <w:rPr>
+          <w:sz w:val="28"/>
+          <w:szCs w:val="28"/>
+          <w:lang w:val="en-US"/>
+        </w:rPr>
+        <w:t xml:space="preserve">        },</w:t>
+      </w:r>
+    </w:p>
+    <w:p>
+      <w:pPr>
+        <w:rPr>
+          <w:sz w:val="28"/>
+          <w:szCs w:val="28"/>
+          <w:lang w:val="en-US"/>
+        </w:rPr>
+      </w:pPr>
+      <w:r>
+        <w:rPr>
+          <w:sz w:val="28"/>
+          <w:szCs w:val="28"/>
+          <w:lang w:val="en-US"/>
+        </w:rPr>
+        <w:t xml:space="preserve">        {</w:t>
+      </w:r>
+    </w:p>
+    <w:p>
+      <w:pPr>
+        <w:rPr>
+          <w:sz w:val="28"/>
+          <w:szCs w:val="28"/>
+          <w:lang w:val="en-US"/>
+        </w:rPr>
+      </w:pPr>
+      <w:r>
+        <w:rPr>
+          <w:sz w:val="28"/>
+          <w:szCs w:val="28"/>
+          <w:lang w:val="en-US"/>
+        </w:rPr>
+        <w:t xml:space="preserve">            "name":"Vitamin C",</w:t>
+      </w:r>
+    </w:p>
+    <w:p>
+      <w:pPr>
+        <w:rPr>
+          <w:sz w:val="28"/>
+          <w:szCs w:val="28"/>
+          <w:lang w:val="en-US"/>
+        </w:rPr>
+      </w:pPr>
+      <w:r>
+        <w:rPr>
+          <w:sz w:val="28"/>
+          <w:szCs w:val="28"/>
+          <w:lang w:val="en-US"/>
+        </w:rPr>
+        <w:t xml:space="preserve">            "dosage":"500 mg",</w:t>
+      </w:r>
+    </w:p>
+    <w:p>
+      <w:pPr>
+        <w:rPr>
+          <w:sz w:val="28"/>
+          <w:szCs w:val="28"/>
+          <w:lang w:val="en-US"/>
+        </w:rPr>
+      </w:pPr>
+      <w:r>
+        <w:rPr>
+          <w:sz w:val="28"/>
+          <w:szCs w:val="28"/>
+          <w:lang w:val="en-US"/>
+        </w:rPr>
         <w:lastRenderedPageBreak/>
-        <w:t xml:space="preserve">  "specialization": "Cardiologist",</w:t>
-      </w:r>
-    </w:p>
-    <w:p>
-      <w:pPr>
-        <w:rPr>
-          <w:sz w:val="28"/>
-          <w:szCs w:val="28"/>
-          <w:lang w:val="en-US"/>
-        </w:rPr>
-      </w:pPr>
-      <w:r>
-        <w:rPr>
-          <w:sz w:val="28"/>
-          <w:szCs w:val="28"/>
-          <w:lang w:val="en-US"/>
-        </w:rPr>
-        <w:t xml:space="preserve">  "experience": "8 years",</w:t>
-      </w:r>
-    </w:p>
-    <w:p>
-      <w:pPr>
-        <w:rPr>
-          <w:sz w:val="28"/>
-          <w:szCs w:val="28"/>
-          <w:lang w:val="en-US"/>
-        </w:rPr>
-      </w:pPr>
-      <w:r>
-        <w:rPr>
-          <w:sz w:val="28"/>
-          <w:szCs w:val="28"/>
-          <w:lang w:val="en-US"/>
-        </w:rPr>
-        <w:t xml:space="preserve">  "contact": "9999999999"</w:t>
+        <w:t xml:space="preserve">            "frequency":"Once Daily",</w:t>
+      </w:r>
+    </w:p>
+    <w:p>
+      <w:pPr>
+        <w:rPr>
+          <w:sz w:val="28"/>
+          <w:szCs w:val="28"/>
+          <w:lang w:val="en-US"/>
+        </w:rPr>
+      </w:pPr>
+      <w:r>
+        <w:rPr>
+          <w:sz w:val="28"/>
+          <w:szCs w:val="28"/>
+          <w:lang w:val="en-US"/>
+        </w:rPr>
+        <w:t xml:space="preserve">            "duration":"7 Days"</w:t>
+      </w:r>
+    </w:p>
+    <w:p>
+      <w:pPr>
+        <w:rPr>
+          <w:sz w:val="28"/>
+          <w:szCs w:val="28"/>
+          <w:lang w:val="en-US"/>
+        </w:rPr>
+      </w:pPr>
+      <w:r>
+        <w:rPr>
+          <w:sz w:val="28"/>
+          <w:szCs w:val="28"/>
+          <w:lang w:val="en-US"/>
+        </w:rPr>
+        <w:t xml:space="preserve">        }</w:t>
+      </w:r>
+    </w:p>
+    <w:p>
+      <w:pPr>
+        <w:rPr>
+          <w:sz w:val="28"/>
+          <w:szCs w:val="28"/>
+          <w:lang w:val="en-US"/>
+        </w:rPr>
+      </w:pPr>
+      <w:r>
+        <w:rPr>
+          <w:sz w:val="28"/>
+          <w:szCs w:val="28"/>
+          <w:lang w:val="en-US"/>
+        </w:rPr>
+        <w:t xml:space="preserve">    ],</w:t>
+      </w:r>
+    </w:p>
+    <w:p>
+      <w:pPr>
+        <w:rPr>
+          <w:sz w:val="28"/>
+          <w:szCs w:val="28"/>
+          <w:lang w:val="en-US"/>
+        </w:rPr>
+      </w:pPr>
+    </w:p>
+    <w:p>
+      <w:pPr>
+        <w:rPr>
+          <w:sz w:val="28"/>
+          <w:szCs w:val="28"/>
+          <w:lang w:val="en-US"/>
+        </w:rPr>
+      </w:pPr>
+      <w:r>
+        <w:rPr>
+          <w:sz w:val="28"/>
+          <w:szCs w:val="28"/>
+          <w:lang w:val="en-US"/>
+        </w:rPr>
+        <w:t xml:space="preserve">    "instructions":"Take after meals"</w:t>
       </w:r>
     </w:p>
     <w:p>
@@ -4295,32 +4475,348 @@
           <w:szCs w:val="28"/>
           <w:lang w:val="en-US"/>
         </w:rPr>
-        <w:t>Department collection-</w:t>
-      </w:r>
-      <w:r>
-        <w:rPr>
-          <w:sz w:val="28"/>
-          <w:szCs w:val="28"/>
-          <w:lang w:val="en-US"/>
+        <w:t>APPOINTNMENT SCHEMA-</w:t>
+      </w:r>
+    </w:p>
+    <w:p>
+      <w:pPr>
+        <w:rPr>
+          <w:sz w:val="28"/>
+          <w:szCs w:val="28"/>
+          <w:lang w:val="en-US"/>
+        </w:rPr>
+      </w:pPr>
+      <w:r>
+        <w:rPr>
+          <w:sz w:val="28"/>
+          <w:szCs w:val="28"/>
+        </w:rPr>
+        <w:t>patientId: {</w:t>
+      </w:r>
+      <w:r>
+        <w:rPr>
+          <w:sz w:val="28"/>
+          <w:szCs w:val="28"/>
         </w:rPr>
         <w:br/>
-      </w:r>
-      <w:r>
-        <w:rPr>
-          <w:sz w:val="28"/>
-          <w:szCs w:val="28"/>
-          <w:lang w:val="en-US"/>
-        </w:rPr>
-        <w:tab/>
-      </w:r>
-      <w:r>
-        <w:rPr>
-          <w:sz w:val="28"/>
-          <w:szCs w:val="28"/>
-          <w:lang w:val="en-US"/>
-        </w:rPr>
-        <w:tab/>
-      </w:r>
+        <w:t>type: mongoose.Schema.Types.ObjectId,</w:t>
+      </w:r>
+      <w:r>
+        <w:rPr>
+          <w:sz w:val="28"/>
+          <w:szCs w:val="28"/>
+        </w:rPr>
+        <w:br/>
+        <w:t>ref: "Patient",</w:t>
+      </w:r>
+      <w:r>
+        <w:rPr>
+          <w:sz w:val="28"/>
+          <w:szCs w:val="28"/>
+        </w:rPr>
+        <w:br/>
+        <w:t>required: true</w:t>
+      </w:r>
+      <w:r>
+        <w:rPr>
+          <w:sz w:val="28"/>
+          <w:szCs w:val="28"/>
+        </w:rPr>
+        <w:br/>
+        <w:t>},</w:t>
+      </w:r>
+      <w:r>
+        <w:rPr>
+          <w:sz w:val="28"/>
+          <w:szCs w:val="28"/>
+        </w:rPr>
+        <w:br/>
+      </w:r>
+      <w:r>
+        <w:rPr>
+          <w:sz w:val="28"/>
+          <w:szCs w:val="28"/>
+        </w:rPr>
+        <w:br/>
+        <w:t>doctorId: {</w:t>
+      </w:r>
+      <w:r>
+        <w:rPr>
+          <w:sz w:val="28"/>
+          <w:szCs w:val="28"/>
+        </w:rPr>
+        <w:br/>
+        <w:t>type: mongoose.Schema.Types.ObjectId,</w:t>
+      </w:r>
+      <w:r>
+        <w:rPr>
+          <w:sz w:val="28"/>
+          <w:szCs w:val="28"/>
+        </w:rPr>
+        <w:br/>
+        <w:t>ref: "Doctor",</w:t>
+      </w:r>
+      <w:r>
+        <w:rPr>
+          <w:sz w:val="28"/>
+          <w:szCs w:val="28"/>
+        </w:rPr>
+        <w:br/>
+        <w:t>required: true</w:t>
+      </w:r>
+      <w:r>
+        <w:rPr>
+          <w:sz w:val="28"/>
+          <w:szCs w:val="28"/>
+        </w:rPr>
+        <w:br/>
+        <w:t>},</w:t>
+      </w:r>
+      <w:r>
+        <w:rPr>
+          <w:sz w:val="28"/>
+          <w:szCs w:val="28"/>
+        </w:rPr>
+        <w:br/>
+      </w:r>
+      <w:r>
+        <w:rPr>
+          <w:sz w:val="28"/>
+          <w:szCs w:val="28"/>
+        </w:rPr>
+        <w:br/>
+        <w:t>date: {</w:t>
+      </w:r>
+      <w:r>
+        <w:rPr>
+          <w:sz w:val="28"/>
+          <w:szCs w:val="28"/>
+        </w:rPr>
+        <w:br/>
+        <w:t>type: Date,</w:t>
+      </w:r>
+      <w:r>
+        <w:rPr>
+          <w:sz w:val="28"/>
+          <w:szCs w:val="28"/>
+        </w:rPr>
+        <w:br/>
+        <w:t>required: true</w:t>
+      </w:r>
+      <w:r>
+        <w:rPr>
+          <w:sz w:val="28"/>
+          <w:szCs w:val="28"/>
+        </w:rPr>
+        <w:br/>
+        <w:t>},</w:t>
+      </w:r>
+      <w:r>
+        <w:rPr>
+          <w:sz w:val="28"/>
+          <w:szCs w:val="28"/>
+        </w:rPr>
+        <w:br/>
+      </w:r>
+      <w:r>
+        <w:rPr>
+          <w:sz w:val="28"/>
+          <w:szCs w:val="28"/>
+        </w:rPr>
+        <w:br/>
+        <w:t>time: {</w:t>
+      </w:r>
+      <w:r>
+        <w:rPr>
+          <w:sz w:val="28"/>
+          <w:szCs w:val="28"/>
+        </w:rPr>
+        <w:br/>
+        <w:t>type: String,</w:t>
+      </w:r>
+      <w:r>
+        <w:rPr>
+          <w:sz w:val="28"/>
+          <w:szCs w:val="28"/>
+        </w:rPr>
+        <w:br/>
+        <w:t>required: true</w:t>
+      </w:r>
+      <w:r>
+        <w:rPr>
+          <w:sz w:val="28"/>
+          <w:szCs w:val="28"/>
+        </w:rPr>
+        <w:br/>
+        <w:t>},</w:t>
+      </w:r>
+      <w:r>
+        <w:rPr>
+          <w:sz w:val="28"/>
+          <w:szCs w:val="28"/>
+        </w:rPr>
+        <w:br/>
+      </w:r>
+      <w:r>
+        <w:rPr>
+          <w:sz w:val="28"/>
+          <w:szCs w:val="28"/>
+        </w:rPr>
+        <w:br/>
+        <w:t>status: {</w:t>
+      </w:r>
+      <w:r>
+        <w:rPr>
+          <w:sz w:val="28"/>
+          <w:szCs w:val="28"/>
+        </w:rPr>
+        <w:br/>
+        <w:t>type: String,</w:t>
+      </w:r>
+      <w:r>
+        <w:rPr>
+          <w:sz w:val="28"/>
+          <w:szCs w:val="28"/>
+        </w:rPr>
+        <w:br/>
+        <w:t>enum: [</w:t>
+      </w:r>
+      <w:r>
+        <w:rPr>
+          <w:sz w:val="28"/>
+          <w:szCs w:val="28"/>
+        </w:rPr>
+        <w:br/>
+      </w:r>
+      <w:r>
+        <w:rPr>
+          <w:sz w:val="28"/>
+          <w:szCs w:val="28"/>
+        </w:rPr>
+        <w:lastRenderedPageBreak/>
+        <w:t>"Waiting",</w:t>
+      </w:r>
+      <w:r>
+        <w:rPr>
+          <w:sz w:val="28"/>
+          <w:szCs w:val="28"/>
+        </w:rPr>
+        <w:br/>
+        <w:t>"In Consultation",</w:t>
+      </w:r>
+      <w:r>
+        <w:rPr>
+          <w:sz w:val="28"/>
+          <w:szCs w:val="28"/>
+        </w:rPr>
+        <w:br/>
+        <w:t>"Completed",</w:t>
+      </w:r>
+      <w:r>
+        <w:rPr>
+          <w:sz w:val="28"/>
+          <w:szCs w:val="28"/>
+        </w:rPr>
+        <w:br/>
+        <w:t>"Cancelled",</w:t>
+      </w:r>
+      <w:r>
+        <w:rPr>
+          <w:sz w:val="28"/>
+          <w:szCs w:val="28"/>
+        </w:rPr>
+        <w:br/>
+        <w:t>"No Show"</w:t>
+      </w:r>
+      <w:r>
+        <w:rPr>
+          <w:sz w:val="28"/>
+          <w:szCs w:val="28"/>
+        </w:rPr>
+        <w:br/>
+        <w:t>],</w:t>
+      </w:r>
+      <w:r>
+        <w:rPr>
+          <w:sz w:val="28"/>
+          <w:szCs w:val="28"/>
+        </w:rPr>
+        <w:br/>
+        <w:t>default: "Waiting"</w:t>
+      </w:r>
+      <w:r>
+        <w:rPr>
+          <w:sz w:val="28"/>
+          <w:szCs w:val="28"/>
+        </w:rPr>
+        <w:br/>
+        <w:t>}</w:t>
+      </w:r>
+      <w:r>
+        <w:rPr>
+          <w:sz w:val="28"/>
+          <w:szCs w:val="28"/>
+        </w:rPr>
+        <w:br/>
+      </w:r>
+      <w:r>
+        <w:rPr>
+          <w:sz w:val="28"/>
+          <w:szCs w:val="28"/>
+        </w:rPr>
+        <w:br/>
+        <w:t>}, { timestamps: true });</w:t>
+      </w:r>
+      <w:r>
+        <w:rPr>
+          <w:sz w:val="28"/>
+          <w:szCs w:val="28"/>
+          <w:lang w:val="en-US"/>
+        </w:rPr>
+        <w:t>}</w:t>
+      </w:r>
+    </w:p>
+    <w:p>
+      <w:pPr>
+        <w:rPr>
+          <w:sz w:val="28"/>
+          <w:szCs w:val="28"/>
+          <w:lang w:val="en-US"/>
+        </w:rPr>
+      </w:pPr>
+    </w:p>
+    <w:p>
+      <w:pPr>
+        <w:rPr>
+          <w:sz w:val="28"/>
+          <w:szCs w:val="28"/>
+          <w:lang w:val="en-US"/>
+        </w:rPr>
+      </w:pPr>
+    </w:p>
+    <w:p>
+      <w:pPr>
+        <w:rPr>
+          <w:sz w:val="28"/>
+          <w:szCs w:val="28"/>
+        </w:rPr>
+      </w:pPr>
+      <w:r>
+        <w:rPr>
+          <w:sz w:val="28"/>
+          <w:szCs w:val="28"/>
+        </w:rPr>
+        <w:t>REPORTS COLLECTION</w:t>
+      </w:r>
+    </w:p>
+    <w:p>
+      <w:pPr>
+        <w:rPr>
+          <w:sz w:val="28"/>
+          <w:szCs w:val="28"/>
+          <w:lang w:val="en-US"/>
+        </w:rPr>
+      </w:pPr>
       <w:r>
         <w:rPr>
           <w:sz w:val="28"/>
@@ -4344,164 +4840,92 @@
           <w:szCs w:val="28"/>
           <w:lang w:val="en-US"/>
         </w:rPr>
-        <w:t xml:space="preserve">  "</w:t>
-      </w:r>
-      <w:proofErr w:type="spellStart"/>
-      <w:r>
-        <w:rPr>
-          <w:sz w:val="28"/>
-          <w:szCs w:val="28"/>
-          <w:lang w:val="en-US"/>
-        </w:rPr>
-        <w:t>departmentId</w:t>
-      </w:r>
-      <w:proofErr w:type="spellEnd"/>
-      <w:r>
-        <w:rPr>
-          <w:sz w:val="28"/>
-          <w:szCs w:val="28"/>
-          <w:lang w:val="en-US"/>
-        </w:rPr>
-        <w:t>": "DEP001",</w:t>
-      </w:r>
-    </w:p>
-    <w:p>
-      <w:pPr>
-        <w:rPr>
-          <w:sz w:val="28"/>
-          <w:szCs w:val="28"/>
-          <w:lang w:val="en-US"/>
-        </w:rPr>
-      </w:pPr>
-      <w:r>
-        <w:rPr>
-          <w:sz w:val="28"/>
-          <w:szCs w:val="28"/>
-          <w:lang w:val="en-US"/>
-        </w:rPr>
-        <w:t xml:space="preserve">  "</w:t>
-      </w:r>
-      <w:proofErr w:type="spellStart"/>
-      <w:r>
-        <w:rPr>
-          <w:sz w:val="28"/>
-          <w:szCs w:val="28"/>
-          <w:lang w:val="en-US"/>
-        </w:rPr>
-        <w:t>departmentName</w:t>
-      </w:r>
-      <w:proofErr w:type="spellEnd"/>
-      <w:r>
-        <w:rPr>
-          <w:sz w:val="28"/>
-          <w:szCs w:val="28"/>
-          <w:lang w:val="en-US"/>
-        </w:rPr>
-        <w:t>": "Cardiology",</w:t>
-      </w:r>
-    </w:p>
-    <w:p>
-      <w:pPr>
-        <w:rPr>
-          <w:sz w:val="28"/>
-          <w:szCs w:val="28"/>
-          <w:lang w:val="en-US"/>
-        </w:rPr>
-      </w:pPr>
-      <w:r>
-        <w:rPr>
-          <w:sz w:val="28"/>
-          <w:szCs w:val="28"/>
-          <w:lang w:val="en-US"/>
-        </w:rPr>
-        <w:t xml:space="preserve">  "</w:t>
-      </w:r>
-      <w:proofErr w:type="spellStart"/>
-      <w:r>
-        <w:rPr>
-          <w:sz w:val="28"/>
-          <w:szCs w:val="28"/>
-          <w:lang w:val="en-US"/>
-        </w:rPr>
-        <w:t>headDoctorId</w:t>
-      </w:r>
-      <w:proofErr w:type="spellEnd"/>
-      <w:r>
-        <w:rPr>
-          <w:sz w:val="28"/>
-          <w:szCs w:val="28"/>
-          <w:lang w:val="en-US"/>
-        </w:rPr>
-        <w:t>": "D001",</w:t>
-      </w:r>
-    </w:p>
-    <w:p>
-      <w:pPr>
-        <w:rPr>
-          <w:sz w:val="28"/>
-          <w:szCs w:val="28"/>
-          <w:lang w:val="en-US"/>
-        </w:rPr>
-      </w:pPr>
-      <w:r>
-        <w:rPr>
-          <w:sz w:val="28"/>
-          <w:szCs w:val="28"/>
-          <w:lang w:val="en-US"/>
-        </w:rPr>
-        <w:t xml:space="preserve">  "location": "Block A - Floor 2",</w:t>
-      </w:r>
-    </w:p>
-    <w:p>
-      <w:pPr>
-        <w:rPr>
-          <w:sz w:val="28"/>
-          <w:szCs w:val="28"/>
-          <w:lang w:val="en-US"/>
-        </w:rPr>
-      </w:pPr>
-      <w:r>
-        <w:rPr>
-          <w:sz w:val="28"/>
-          <w:szCs w:val="28"/>
-          <w:lang w:val="en-US"/>
-        </w:rPr>
-        <w:t xml:space="preserve">  "</w:t>
-      </w:r>
-      <w:proofErr w:type="spellStart"/>
-      <w:r>
-        <w:rPr>
-          <w:sz w:val="28"/>
-          <w:szCs w:val="28"/>
-          <w:lang w:val="en-US"/>
-        </w:rPr>
-        <w:t>contactNumber</w:t>
-      </w:r>
-      <w:proofErr w:type="spellEnd"/>
-      <w:r>
-        <w:rPr>
-          <w:sz w:val="28"/>
-          <w:szCs w:val="28"/>
-          <w:lang w:val="en-US"/>
-        </w:rPr>
-        <w:t>": "011-45678901",</w:t>
-      </w:r>
-    </w:p>
-    <w:p>
-      <w:pPr>
-        <w:rPr>
-          <w:sz w:val="28"/>
-          <w:szCs w:val="28"/>
-          <w:lang w:val="en-US"/>
-        </w:rPr>
-      </w:pPr>
-      <w:r>
-        <w:rPr>
-          <w:sz w:val="28"/>
-          <w:szCs w:val="28"/>
-          <w:lang w:val="en-US"/>
-        </w:rPr>
-        <w:t xml:space="preserve">  "status": "Active"</w:t>
+        <w:t xml:space="preserve">  "reportId": "R401",</w:t>
+      </w:r>
+    </w:p>
+    <w:p>
+      <w:pPr>
+        <w:rPr>
+          <w:sz w:val="28"/>
+          <w:szCs w:val="28"/>
+          <w:lang w:val="en-US"/>
+        </w:rPr>
+      </w:pPr>
+      <w:r>
+        <w:rPr>
+          <w:sz w:val="28"/>
+          <w:szCs w:val="28"/>
+          <w:lang w:val="en-US"/>
+        </w:rPr>
+        <w:t xml:space="preserve">  "patientId": "P101",</w:t>
+      </w:r>
+    </w:p>
+    <w:p>
+      <w:pPr>
+        <w:rPr>
+          <w:sz w:val="28"/>
+          <w:szCs w:val="28"/>
+          <w:lang w:val="en-US"/>
+        </w:rPr>
+      </w:pPr>
+      <w:r>
+        <w:rPr>
+          <w:sz w:val="28"/>
+          <w:szCs w:val="28"/>
+          <w:lang w:val="en-US"/>
+        </w:rPr>
+        <w:t xml:space="preserve">  "reportName": "Blood Test",</w:t>
+      </w:r>
+    </w:p>
+    <w:p>
+      <w:pPr>
+        <w:rPr>
+          <w:sz w:val="28"/>
+          <w:szCs w:val="28"/>
+          <w:lang w:val="en-US"/>
+        </w:rPr>
+      </w:pPr>
+      <w:r>
+        <w:rPr>
+          <w:sz w:val="28"/>
+          <w:szCs w:val="28"/>
+          <w:lang w:val="en-US"/>
+        </w:rPr>
+        <w:t xml:space="preserve">  "fileUrl": "/uploads/bloodtest.pdf",</w:t>
+      </w:r>
+    </w:p>
+    <w:p>
+      <w:pPr>
+        <w:rPr>
+          <w:sz w:val="28"/>
+          <w:szCs w:val="28"/>
+          <w:lang w:val="en-US"/>
+        </w:rPr>
+      </w:pPr>
+      <w:r>
+        <w:rPr>
+          <w:sz w:val="28"/>
+          <w:szCs w:val="28"/>
+          <w:lang w:val="en-US"/>
+        </w:rPr>
+        <w:t xml:space="preserve">  "uploadedBy": "Doctor",</w:t>
+      </w:r>
+    </w:p>
+    <w:p>
+      <w:pPr>
+        <w:rPr>
+          <w:sz w:val="28"/>
+          <w:szCs w:val="28"/>
+          <w:lang w:val="en-US"/>
+        </w:rPr>
+      </w:pPr>
+      <w:r>
+        <w:rPr>
+          <w:sz w:val="28"/>
+          <w:szCs w:val="28"/>
+          <w:lang w:val="en-US"/>
+        </w:rPr>
+        <w:t xml:space="preserve">  "uploadedAt": "2026-07-04"</w:t>
       </w:r>
     </w:p>
     <w:p>
@@ -4535,1272 +4959,37 @@
         <w:rPr>
           <w:sz w:val="28"/>
           <w:szCs w:val="28"/>
-          <w:lang w:val="en-US"/>
-        </w:rPr>
-      </w:pPr>
-      <w:r>
-        <w:rPr>
-          <w:sz w:val="28"/>
-          <w:szCs w:val="28"/>
-          <w:lang w:val="en-US"/>
+        </w:rPr>
+      </w:pPr>
+      <w:r>
+        <w:rPr>
+          <w:sz w:val="28"/>
+          <w:szCs w:val="28"/>
+          <w:lang w:val="en-US"/>
+        </w:rPr>
+        <w:t>Admin collection-</w:t>
+      </w:r>
+      <w:r>
+        <w:rPr>
+          <w:sz w:val="28"/>
+          <w:szCs w:val="28"/>
+          <w:lang w:val="en-US"/>
+        </w:rPr>
+        <w:br/>
+      </w:r>
+      <w:r>
+        <w:rPr>
+          <w:sz w:val="28"/>
+          <w:szCs w:val="28"/>
         </w:rPr>
         <w:t>{</w:t>
       </w:r>
-    </w:p>
-    <w:p>
-      <w:pPr>
-        <w:rPr>
-          <w:sz w:val="28"/>
-          <w:szCs w:val="28"/>
-          <w:lang w:val="en-US"/>
-        </w:rPr>
-      </w:pPr>
-      <w:r>
-        <w:rPr>
-          <w:sz w:val="28"/>
-          <w:szCs w:val="28"/>
-          <w:lang w:val="en-US"/>
-        </w:rPr>
-        <w:t xml:space="preserve">    "prescriptionId":"PR001",</w:t>
-      </w:r>
-    </w:p>
-    <w:p>
-      <w:pPr>
-        <w:rPr>
-          <w:sz w:val="28"/>
-          <w:szCs w:val="28"/>
-          <w:lang w:val="en-US"/>
-        </w:rPr>
-      </w:pPr>
-      <w:r>
-        <w:rPr>
-          <w:sz w:val="28"/>
-          <w:szCs w:val="28"/>
-          <w:lang w:val="en-US"/>
-        </w:rPr>
-        <w:t xml:space="preserve">    "patientId":"P001",</w:t>
-      </w:r>
-    </w:p>
-    <w:p>
-      <w:pPr>
-        <w:rPr>
-          <w:sz w:val="28"/>
-          <w:szCs w:val="28"/>
-          <w:lang w:val="en-US"/>
-        </w:rPr>
-      </w:pPr>
-      <w:r>
-        <w:rPr>
-          <w:sz w:val="28"/>
-          <w:szCs w:val="28"/>
-          <w:lang w:val="en-US"/>
-        </w:rPr>
-        <w:t xml:space="preserve">    "doctorId":"D001",</w:t>
-      </w:r>
-    </w:p>
-    <w:p>
-      <w:pPr>
-        <w:rPr>
-          <w:sz w:val="28"/>
-          <w:szCs w:val="28"/>
-          <w:lang w:val="en-US"/>
-        </w:rPr>
-      </w:pPr>
-      <w:r>
-        <w:rPr>
-          <w:sz w:val="28"/>
-          <w:szCs w:val="28"/>
-          <w:lang w:val="en-US"/>
-        </w:rPr>
-        <w:t xml:space="preserve">    "diagnosisId":"DG001",</w:t>
-      </w:r>
-    </w:p>
-    <w:p>
-      <w:pPr>
-        <w:rPr>
-          <w:sz w:val="28"/>
-          <w:szCs w:val="28"/>
-          <w:lang w:val="en-US"/>
-        </w:rPr>
-      </w:pPr>
-    </w:p>
-    <w:p>
-      <w:pPr>
-        <w:rPr>
-          <w:sz w:val="28"/>
-          <w:szCs w:val="28"/>
-          <w:lang w:val="en-US"/>
-        </w:rPr>
-      </w:pPr>
-      <w:r>
-        <w:rPr>
-          <w:sz w:val="28"/>
-          <w:szCs w:val="28"/>
-          <w:lang w:val="en-US"/>
-        </w:rPr>
-        <w:t xml:space="preserve">    "medicines</w:t>
-      </w:r>
-      <w:proofErr w:type="gramStart"/>
-      <w:r>
-        <w:rPr>
-          <w:sz w:val="28"/>
-          <w:szCs w:val="28"/>
-          <w:lang w:val="en-US"/>
-        </w:rPr>
-        <w:t>":[</w:t>
-      </w:r>
-      <w:proofErr w:type="gramEnd"/>
-    </w:p>
-    <w:p>
-      <w:pPr>
-        <w:rPr>
-          <w:sz w:val="28"/>
-          <w:szCs w:val="28"/>
-          <w:lang w:val="en-US"/>
-        </w:rPr>
-      </w:pPr>
-      <w:r>
-        <w:rPr>
-          <w:sz w:val="28"/>
-          <w:szCs w:val="28"/>
-          <w:lang w:val="en-US"/>
-        </w:rPr>
-        <w:t xml:space="preserve">        {</w:t>
-      </w:r>
-    </w:p>
-    <w:p>
-      <w:pPr>
-        <w:rPr>
-          <w:sz w:val="28"/>
-          <w:szCs w:val="28"/>
-          <w:lang w:val="en-US"/>
-        </w:rPr>
-      </w:pPr>
-      <w:r>
-        <w:rPr>
-          <w:sz w:val="28"/>
-          <w:szCs w:val="28"/>
-          <w:lang w:val="en-US"/>
-        </w:rPr>
-        <w:t xml:space="preserve">            "</w:t>
-      </w:r>
-      <w:proofErr w:type="spellStart"/>
-      <w:r>
-        <w:rPr>
-          <w:sz w:val="28"/>
-          <w:szCs w:val="28"/>
-          <w:lang w:val="en-US"/>
-        </w:rPr>
-        <w:t>name":"Paracetamol</w:t>
-      </w:r>
-      <w:proofErr w:type="spellEnd"/>
-      <w:r>
-        <w:rPr>
-          <w:sz w:val="28"/>
-          <w:szCs w:val="28"/>
-          <w:lang w:val="en-US"/>
-        </w:rPr>
-        <w:t>",</w:t>
-      </w:r>
-    </w:p>
-    <w:p>
-      <w:pPr>
-        <w:rPr>
-          <w:sz w:val="28"/>
-          <w:szCs w:val="28"/>
-          <w:lang w:val="en-US"/>
-        </w:rPr>
-      </w:pPr>
-      <w:r>
-        <w:rPr>
-          <w:sz w:val="28"/>
-          <w:szCs w:val="28"/>
-          <w:lang w:val="en-US"/>
-        </w:rPr>
-        <w:t xml:space="preserve">            "dosage":"500 mg",</w:t>
-      </w:r>
-    </w:p>
-    <w:p>
-      <w:pPr>
-        <w:rPr>
-          <w:sz w:val="28"/>
-          <w:szCs w:val="28"/>
-          <w:lang w:val="en-US"/>
-        </w:rPr>
-      </w:pPr>
-      <w:r>
-        <w:rPr>
-          <w:sz w:val="28"/>
-          <w:szCs w:val="28"/>
-          <w:lang w:val="en-US"/>
-        </w:rPr>
-        <w:t xml:space="preserve">            "</w:t>
-      </w:r>
-      <w:proofErr w:type="spellStart"/>
-      <w:r>
-        <w:rPr>
-          <w:sz w:val="28"/>
-          <w:szCs w:val="28"/>
-          <w:lang w:val="en-US"/>
-        </w:rPr>
-        <w:t>frequency":"Twice</w:t>
-      </w:r>
-      <w:proofErr w:type="spellEnd"/>
-      <w:r>
-        <w:rPr>
-          <w:sz w:val="28"/>
-          <w:szCs w:val="28"/>
-          <w:lang w:val="en-US"/>
-        </w:rPr>
-        <w:t xml:space="preserve"> Daily",</w:t>
-      </w:r>
-    </w:p>
-    <w:p>
-      <w:pPr>
-        <w:rPr>
-          <w:sz w:val="28"/>
-          <w:szCs w:val="28"/>
-          <w:lang w:val="en-US"/>
-        </w:rPr>
-      </w:pPr>
-      <w:r>
-        <w:rPr>
-          <w:sz w:val="28"/>
-          <w:szCs w:val="28"/>
-          <w:lang w:val="en-US"/>
-        </w:rPr>
-        <w:t xml:space="preserve">            "duration":"5 Days"</w:t>
-      </w:r>
-    </w:p>
-    <w:p>
-      <w:pPr>
-        <w:rPr>
-          <w:sz w:val="28"/>
-          <w:szCs w:val="28"/>
-          <w:lang w:val="en-US"/>
-        </w:rPr>
-      </w:pPr>
-      <w:r>
-        <w:rPr>
-          <w:sz w:val="28"/>
-          <w:szCs w:val="28"/>
-          <w:lang w:val="en-US"/>
-        </w:rPr>
-        <w:lastRenderedPageBreak/>
-        <w:t xml:space="preserve">        },</w:t>
-      </w:r>
-    </w:p>
-    <w:p>
-      <w:pPr>
-        <w:rPr>
-          <w:sz w:val="28"/>
-          <w:szCs w:val="28"/>
-          <w:lang w:val="en-US"/>
-        </w:rPr>
-      </w:pPr>
-      <w:r>
-        <w:rPr>
-          <w:sz w:val="28"/>
-          <w:szCs w:val="28"/>
-          <w:lang w:val="en-US"/>
-        </w:rPr>
-        <w:t xml:space="preserve">        {</w:t>
-      </w:r>
-    </w:p>
-    <w:p>
-      <w:pPr>
-        <w:rPr>
-          <w:sz w:val="28"/>
-          <w:szCs w:val="28"/>
-          <w:lang w:val="en-US"/>
-        </w:rPr>
-      </w:pPr>
-      <w:r>
-        <w:rPr>
-          <w:sz w:val="28"/>
-          <w:szCs w:val="28"/>
-          <w:lang w:val="en-US"/>
-        </w:rPr>
-        <w:t xml:space="preserve">            "</w:t>
-      </w:r>
-      <w:proofErr w:type="spellStart"/>
-      <w:r>
-        <w:rPr>
-          <w:sz w:val="28"/>
-          <w:szCs w:val="28"/>
-          <w:lang w:val="en-US"/>
-        </w:rPr>
-        <w:t>name":"Vitamin</w:t>
-      </w:r>
-      <w:proofErr w:type="spellEnd"/>
-      <w:r>
-        <w:rPr>
-          <w:sz w:val="28"/>
-          <w:szCs w:val="28"/>
-          <w:lang w:val="en-US"/>
-        </w:rPr>
-        <w:t xml:space="preserve"> C",</w:t>
-      </w:r>
-    </w:p>
-    <w:p>
-      <w:pPr>
-        <w:rPr>
-          <w:sz w:val="28"/>
-          <w:szCs w:val="28"/>
-          <w:lang w:val="en-US"/>
-        </w:rPr>
-      </w:pPr>
-      <w:r>
-        <w:rPr>
-          <w:sz w:val="28"/>
-          <w:szCs w:val="28"/>
-          <w:lang w:val="en-US"/>
-        </w:rPr>
-        <w:t xml:space="preserve">            "dosage":"500 mg",</w:t>
-      </w:r>
-    </w:p>
-    <w:p>
-      <w:pPr>
-        <w:rPr>
-          <w:sz w:val="28"/>
-          <w:szCs w:val="28"/>
-          <w:lang w:val="en-US"/>
-        </w:rPr>
-      </w:pPr>
-      <w:r>
-        <w:rPr>
-          <w:sz w:val="28"/>
-          <w:szCs w:val="28"/>
-          <w:lang w:val="en-US"/>
-        </w:rPr>
-        <w:t xml:space="preserve">            "</w:t>
-      </w:r>
-      <w:proofErr w:type="spellStart"/>
-      <w:r>
-        <w:rPr>
-          <w:sz w:val="28"/>
-          <w:szCs w:val="28"/>
-          <w:lang w:val="en-US"/>
-        </w:rPr>
-        <w:t>frequency":"Once</w:t>
-      </w:r>
-      <w:proofErr w:type="spellEnd"/>
-      <w:r>
-        <w:rPr>
-          <w:sz w:val="28"/>
-          <w:szCs w:val="28"/>
-          <w:lang w:val="en-US"/>
-        </w:rPr>
-        <w:t xml:space="preserve"> Daily",</w:t>
-      </w:r>
-    </w:p>
-    <w:p>
-      <w:pPr>
-        <w:rPr>
-          <w:sz w:val="28"/>
-          <w:szCs w:val="28"/>
-          <w:lang w:val="en-US"/>
-        </w:rPr>
-      </w:pPr>
-      <w:r>
-        <w:rPr>
-          <w:sz w:val="28"/>
-          <w:szCs w:val="28"/>
-          <w:lang w:val="en-US"/>
-        </w:rPr>
-        <w:t xml:space="preserve">            "duration":"7 Days"</w:t>
-      </w:r>
-    </w:p>
-    <w:p>
-      <w:pPr>
-        <w:rPr>
-          <w:sz w:val="28"/>
-          <w:szCs w:val="28"/>
-          <w:lang w:val="en-US"/>
-        </w:rPr>
-      </w:pPr>
-      <w:r>
-        <w:rPr>
-          <w:sz w:val="28"/>
-          <w:szCs w:val="28"/>
-          <w:lang w:val="en-US"/>
-        </w:rPr>
-        <w:t xml:space="preserve">        }</w:t>
-      </w:r>
-    </w:p>
-    <w:p>
-      <w:pPr>
-        <w:rPr>
-          <w:sz w:val="28"/>
-          <w:szCs w:val="28"/>
-          <w:lang w:val="en-US"/>
-        </w:rPr>
-      </w:pPr>
-      <w:r>
-        <w:rPr>
-          <w:sz w:val="28"/>
-          <w:szCs w:val="28"/>
-          <w:lang w:val="en-US"/>
-        </w:rPr>
-        <w:t xml:space="preserve">    ],</w:t>
-      </w:r>
-    </w:p>
-    <w:p>
-      <w:pPr>
-        <w:rPr>
-          <w:sz w:val="28"/>
-          <w:szCs w:val="28"/>
-          <w:lang w:val="en-US"/>
-        </w:rPr>
-      </w:pPr>
-    </w:p>
-    <w:p>
-      <w:pPr>
-        <w:rPr>
-          <w:sz w:val="28"/>
-          <w:szCs w:val="28"/>
-          <w:lang w:val="en-US"/>
-        </w:rPr>
-      </w:pPr>
-      <w:r>
-        <w:rPr>
-          <w:sz w:val="28"/>
-          <w:szCs w:val="28"/>
-          <w:lang w:val="en-US"/>
-        </w:rPr>
-        <w:t xml:space="preserve">    "</w:t>
-      </w:r>
-      <w:proofErr w:type="spellStart"/>
-      <w:r>
-        <w:rPr>
-          <w:sz w:val="28"/>
-          <w:szCs w:val="28"/>
-          <w:lang w:val="en-US"/>
-        </w:rPr>
-        <w:t>instructions":"Take</w:t>
-      </w:r>
-      <w:proofErr w:type="spellEnd"/>
-      <w:r>
-        <w:rPr>
-          <w:sz w:val="28"/>
-          <w:szCs w:val="28"/>
-          <w:lang w:val="en-US"/>
-        </w:rPr>
-        <w:t xml:space="preserve"> after meals"</w:t>
-      </w:r>
-    </w:p>
-    <w:p>
-      <w:pPr>
-        <w:rPr>
-          <w:sz w:val="28"/>
-          <w:szCs w:val="28"/>
-          <w:lang w:val="en-US"/>
-        </w:rPr>
-      </w:pPr>
-      <w:r>
-        <w:rPr>
-          <w:sz w:val="28"/>
-          <w:szCs w:val="28"/>
-          <w:lang w:val="en-US"/>
-        </w:rPr>
-        <w:t>}</w:t>
-      </w:r>
-    </w:p>
-    <w:p>
-      <w:pPr>
-        <w:rPr>
-          <w:sz w:val="28"/>
-          <w:szCs w:val="28"/>
-          <w:lang w:val="en-US"/>
-        </w:rPr>
-      </w:pPr>
-    </w:p>
-    <w:p>
-      <w:pPr>
-        <w:rPr>
-          <w:sz w:val="28"/>
-          <w:szCs w:val="28"/>
-          <w:lang w:val="en-US"/>
-        </w:rPr>
-      </w:pPr>
-    </w:p>
-    <w:p>
-      <w:pPr>
-        <w:rPr>
-          <w:sz w:val="28"/>
-          <w:szCs w:val="28"/>
-        </w:rPr>
-      </w:pPr>
-      <w:r>
-        <w:rPr>
-          <w:sz w:val="28"/>
-          <w:szCs w:val="28"/>
-        </w:rPr>
-        <w:t>APPOINTMENTS COLLECTION</w:t>
-      </w:r>
-    </w:p>
-    <w:p>
-      <w:pPr>
-        <w:rPr>
-          <w:sz w:val="28"/>
-          <w:szCs w:val="28"/>
-          <w:lang w:val="en-US"/>
-        </w:rPr>
-      </w:pPr>
-      <w:r>
-        <w:rPr>
-          <w:sz w:val="28"/>
-          <w:szCs w:val="28"/>
-          <w:lang w:val="en-US"/>
-        </w:rPr>
-        <w:t>{</w:t>
-      </w:r>
-    </w:p>
-    <w:p>
-      <w:pPr>
-        <w:rPr>
-          <w:sz w:val="28"/>
-          <w:szCs w:val="28"/>
-          <w:lang w:val="en-US"/>
-        </w:rPr>
-      </w:pPr>
-      <w:r>
-        <w:rPr>
-          <w:sz w:val="28"/>
-          <w:szCs w:val="28"/>
-          <w:lang w:val="en-US"/>
-        </w:rPr>
-        <w:t xml:space="preserve">  "</w:t>
-      </w:r>
-      <w:proofErr w:type="spellStart"/>
-      <w:r>
-        <w:rPr>
-          <w:sz w:val="28"/>
-          <w:szCs w:val="28"/>
-          <w:lang w:val="en-US"/>
-        </w:rPr>
-        <w:t>appointmentId</w:t>
-      </w:r>
-      <w:proofErr w:type="spellEnd"/>
-      <w:r>
-        <w:rPr>
-          <w:sz w:val="28"/>
-          <w:szCs w:val="28"/>
-          <w:lang w:val="en-US"/>
-        </w:rPr>
-        <w:t>": "A301",</w:t>
-      </w:r>
-    </w:p>
-    <w:p>
-      <w:pPr>
-        <w:rPr>
-          <w:sz w:val="28"/>
-          <w:szCs w:val="28"/>
-          <w:lang w:val="en-US"/>
-        </w:rPr>
-      </w:pPr>
-      <w:r>
-        <w:rPr>
-          <w:sz w:val="28"/>
-          <w:szCs w:val="28"/>
-          <w:lang w:val="en-US"/>
-        </w:rPr>
-        <w:t xml:space="preserve">  "</w:t>
-      </w:r>
-      <w:proofErr w:type="spellStart"/>
-      <w:r>
-        <w:rPr>
-          <w:sz w:val="28"/>
-          <w:szCs w:val="28"/>
-          <w:lang w:val="en-US"/>
-        </w:rPr>
-        <w:t>patientId</w:t>
-      </w:r>
-      <w:proofErr w:type="spellEnd"/>
-      <w:r>
-        <w:rPr>
-          <w:sz w:val="28"/>
-          <w:szCs w:val="28"/>
-          <w:lang w:val="en-US"/>
-        </w:rPr>
-        <w:t>": "P101",</w:t>
-      </w:r>
-    </w:p>
-    <w:p>
-      <w:pPr>
-        <w:rPr>
-          <w:sz w:val="28"/>
-          <w:szCs w:val="28"/>
-          <w:lang w:val="en-US"/>
-        </w:rPr>
-      </w:pPr>
-      <w:r>
-        <w:rPr>
-          <w:sz w:val="28"/>
-          <w:szCs w:val="28"/>
-          <w:lang w:val="en-US"/>
-        </w:rPr>
-        <w:t xml:space="preserve">  "</w:t>
-      </w:r>
-      <w:proofErr w:type="spellStart"/>
-      <w:r>
-        <w:rPr>
-          <w:sz w:val="28"/>
-          <w:szCs w:val="28"/>
-          <w:lang w:val="en-US"/>
-        </w:rPr>
-        <w:t>doctorId</w:t>
-      </w:r>
-      <w:proofErr w:type="spellEnd"/>
-      <w:r>
-        <w:rPr>
-          <w:sz w:val="28"/>
-          <w:szCs w:val="28"/>
-          <w:lang w:val="en-US"/>
-        </w:rPr>
-        <w:t>": "D201",</w:t>
-      </w:r>
-    </w:p>
-    <w:p>
-      <w:pPr>
-        <w:rPr>
-          <w:sz w:val="28"/>
-          <w:szCs w:val="28"/>
-          <w:lang w:val="en-US"/>
-        </w:rPr>
-      </w:pPr>
-      <w:r>
-        <w:rPr>
-          <w:sz w:val="28"/>
-          <w:szCs w:val="28"/>
-          <w:lang w:val="en-US"/>
-        </w:rPr>
-        <w:t xml:space="preserve">  "date": "2026-07-10",</w:t>
-      </w:r>
-    </w:p>
-    <w:p>
-      <w:pPr>
-        <w:rPr>
-          <w:sz w:val="28"/>
-          <w:szCs w:val="28"/>
-          <w:lang w:val="en-US"/>
-        </w:rPr>
-      </w:pPr>
-      <w:r>
-        <w:rPr>
-          <w:sz w:val="28"/>
-          <w:szCs w:val="28"/>
-          <w:lang w:val="en-US"/>
-        </w:rPr>
-        <w:t xml:space="preserve">  "time": "10:30 AM",</w:t>
-      </w:r>
-    </w:p>
-    <w:p>
-      <w:pPr>
-        <w:rPr>
-          <w:sz w:val="28"/>
-          <w:szCs w:val="28"/>
-          <w:lang w:val="en-US"/>
-        </w:rPr>
-      </w:pPr>
-      <w:r>
-        <w:rPr>
-          <w:sz w:val="28"/>
-          <w:szCs w:val="28"/>
-          <w:lang w:val="en-US"/>
-        </w:rPr>
-        <w:t xml:space="preserve">  "status": "pending"</w:t>
-      </w:r>
-    </w:p>
-    <w:p>
-      <w:pPr>
-        <w:rPr>
-          <w:sz w:val="28"/>
-          <w:szCs w:val="28"/>
-          <w:lang w:val="en-US"/>
-        </w:rPr>
-      </w:pPr>
-      <w:r>
-        <w:rPr>
-          <w:sz w:val="28"/>
-          <w:szCs w:val="28"/>
-          <w:lang w:val="en-US"/>
-        </w:rPr>
-        <w:t>(</w:t>
-      </w:r>
-      <w:proofErr w:type="gramStart"/>
-      <w:r>
-        <w:rPr>
-          <w:sz w:val="28"/>
-          <w:szCs w:val="28"/>
-          <w:lang w:val="en-US"/>
-        </w:rPr>
-        <w:t>status</w:t>
-      </w:r>
-      <w:proofErr w:type="gramEnd"/>
-      <w:r>
-        <w:rPr>
-          <w:sz w:val="28"/>
-          <w:szCs w:val="28"/>
-          <w:lang w:val="en-US"/>
-        </w:rPr>
-        <w:t>: {</w:t>
-      </w:r>
-    </w:p>
-    <w:p>
-      <w:pPr>
-        <w:rPr>
-          <w:sz w:val="28"/>
-          <w:szCs w:val="28"/>
-          <w:lang w:val="en-US"/>
-        </w:rPr>
-      </w:pPr>
-      <w:r>
-        <w:rPr>
-          <w:sz w:val="28"/>
-          <w:szCs w:val="28"/>
-          <w:lang w:val="en-US"/>
-        </w:rPr>
-        <w:t xml:space="preserve">    type: String,</w:t>
-      </w:r>
-    </w:p>
-    <w:p>
-      <w:pPr>
-        <w:rPr>
-          <w:sz w:val="28"/>
-          <w:szCs w:val="28"/>
-          <w:lang w:val="en-US"/>
-        </w:rPr>
-      </w:pPr>
-      <w:r>
-        <w:rPr>
-          <w:sz w:val="28"/>
-          <w:szCs w:val="28"/>
-          <w:lang w:val="en-US"/>
-        </w:rPr>
-        <w:t xml:space="preserve">    </w:t>
-      </w:r>
-      <w:proofErr w:type="spellStart"/>
-      <w:r>
-        <w:rPr>
-          <w:sz w:val="28"/>
-          <w:szCs w:val="28"/>
-          <w:lang w:val="en-US"/>
-        </w:rPr>
-        <w:t>enum</w:t>
-      </w:r>
-      <w:proofErr w:type="spellEnd"/>
-      <w:r>
-        <w:rPr>
-          <w:sz w:val="28"/>
-          <w:szCs w:val="28"/>
-          <w:lang w:val="en-US"/>
-        </w:rPr>
-        <w:t>: [</w:t>
-      </w:r>
-    </w:p>
-    <w:p>
-      <w:pPr>
-        <w:rPr>
-          <w:sz w:val="28"/>
-          <w:szCs w:val="28"/>
-          <w:lang w:val="en-US"/>
-        </w:rPr>
-      </w:pPr>
-      <w:r>
-        <w:rPr>
-          <w:sz w:val="28"/>
-          <w:szCs w:val="28"/>
-          <w:lang w:val="en-US"/>
-        </w:rPr>
-        <w:t xml:space="preserve">        "Waiting",</w:t>
-      </w:r>
-    </w:p>
-    <w:p>
-      <w:pPr>
-        <w:rPr>
-          <w:sz w:val="28"/>
-          <w:szCs w:val="28"/>
-          <w:lang w:val="en-US"/>
-        </w:rPr>
-      </w:pPr>
-      <w:r>
-        <w:rPr>
-          <w:sz w:val="28"/>
-          <w:szCs w:val="28"/>
-          <w:lang w:val="en-US"/>
-        </w:rPr>
-        <w:t xml:space="preserve">        "In Consultation",</w:t>
-      </w:r>
-    </w:p>
-    <w:p>
-      <w:pPr>
-        <w:rPr>
-          <w:sz w:val="28"/>
-          <w:szCs w:val="28"/>
-          <w:lang w:val="en-US"/>
-        </w:rPr>
-      </w:pPr>
-      <w:r>
-        <w:rPr>
-          <w:sz w:val="28"/>
-          <w:szCs w:val="28"/>
-          <w:lang w:val="en-US"/>
-        </w:rPr>
-        <w:lastRenderedPageBreak/>
-        <w:t xml:space="preserve">        "Completed",</w:t>
-      </w:r>
-    </w:p>
-    <w:p>
-      <w:pPr>
-        <w:rPr>
-          <w:sz w:val="28"/>
-          <w:szCs w:val="28"/>
-          <w:lang w:val="en-US"/>
-        </w:rPr>
-      </w:pPr>
-      <w:r>
-        <w:rPr>
-          <w:sz w:val="28"/>
-          <w:szCs w:val="28"/>
-          <w:lang w:val="en-US"/>
-        </w:rPr>
-        <w:t xml:space="preserve">        "Cancelled",</w:t>
-      </w:r>
-    </w:p>
-    <w:p>
-      <w:pPr>
-        <w:rPr>
-          <w:sz w:val="28"/>
-          <w:szCs w:val="28"/>
-          <w:lang w:val="en-US"/>
-        </w:rPr>
-      </w:pPr>
-      <w:r>
-        <w:rPr>
-          <w:sz w:val="28"/>
-          <w:szCs w:val="28"/>
-          <w:lang w:val="en-US"/>
-        </w:rPr>
-        <w:t xml:space="preserve">        "No Show"</w:t>
-      </w:r>
-    </w:p>
-    <w:p>
-      <w:pPr>
-        <w:rPr>
-          <w:sz w:val="28"/>
-          <w:szCs w:val="28"/>
-          <w:lang w:val="en-US"/>
-        </w:rPr>
-      </w:pPr>
-      <w:r>
-        <w:rPr>
-          <w:sz w:val="28"/>
-          <w:szCs w:val="28"/>
-          <w:lang w:val="en-US"/>
-        </w:rPr>
-        <w:t xml:space="preserve">    ],</w:t>
-      </w:r>
-    </w:p>
-    <w:p>
-      <w:pPr>
-        <w:rPr>
-          <w:sz w:val="28"/>
-          <w:szCs w:val="28"/>
-          <w:lang w:val="en-US"/>
-        </w:rPr>
-      </w:pPr>
-      <w:r>
-        <w:rPr>
-          <w:sz w:val="28"/>
-          <w:szCs w:val="28"/>
-          <w:lang w:val="en-US"/>
-        </w:rPr>
-        <w:t xml:space="preserve">    default: "Waiting"</w:t>
-      </w:r>
-    </w:p>
-    <w:p>
-      <w:pPr>
-        <w:rPr>
-          <w:sz w:val="28"/>
-          <w:szCs w:val="28"/>
-          <w:lang w:val="en-US"/>
-        </w:rPr>
-      </w:pPr>
-      <w:r>
-        <w:rPr>
-          <w:sz w:val="28"/>
-          <w:szCs w:val="28"/>
-          <w:lang w:val="en-US"/>
-        </w:rPr>
-        <w:t>}</w:t>
-      </w:r>
-      <w:r>
-        <w:rPr>
-          <w:sz w:val="28"/>
-          <w:szCs w:val="28"/>
-          <w:lang w:val="en-US"/>
-        </w:rPr>
-        <w:t xml:space="preserve"> )</w:t>
-      </w:r>
-    </w:p>
-    <w:p>
-      <w:pPr>
-        <w:rPr>
-          <w:sz w:val="28"/>
-          <w:szCs w:val="28"/>
-          <w:lang w:val="en-US"/>
-        </w:rPr>
-      </w:pPr>
-      <w:r>
-        <w:rPr>
-          <w:sz w:val="28"/>
-          <w:szCs w:val="28"/>
-          <w:lang w:val="en-US"/>
-        </w:rPr>
-        <w:t>}</w:t>
-      </w:r>
-    </w:p>
-    <w:p>
-      <w:pPr>
-        <w:rPr>
-          <w:sz w:val="28"/>
-          <w:szCs w:val="28"/>
-          <w:lang w:val="en-US"/>
-        </w:rPr>
-      </w:pPr>
-    </w:p>
-    <w:p>
-      <w:pPr>
-        <w:rPr>
-          <w:sz w:val="28"/>
-          <w:szCs w:val="28"/>
-          <w:lang w:val="en-US"/>
-        </w:rPr>
-      </w:pPr>
-    </w:p>
-    <w:p>
-      <w:pPr>
-        <w:rPr>
-          <w:sz w:val="28"/>
-          <w:szCs w:val="28"/>
-        </w:rPr>
-      </w:pPr>
-      <w:r>
-        <w:rPr>
-          <w:sz w:val="28"/>
-          <w:szCs w:val="28"/>
-        </w:rPr>
-        <w:t>REPORTS COLLECTION</w:t>
-      </w:r>
-    </w:p>
-    <w:p>
-      <w:pPr>
-        <w:rPr>
-          <w:sz w:val="28"/>
-          <w:szCs w:val="28"/>
-          <w:lang w:val="en-US"/>
-        </w:rPr>
-      </w:pPr>
-      <w:r>
-        <w:rPr>
-          <w:sz w:val="28"/>
-          <w:szCs w:val="28"/>
-          <w:lang w:val="en-US"/>
-        </w:rPr>
-        <w:t>{</w:t>
-      </w:r>
-    </w:p>
-    <w:p>
-      <w:pPr>
-        <w:rPr>
-          <w:sz w:val="28"/>
-          <w:szCs w:val="28"/>
-          <w:lang w:val="en-US"/>
-        </w:rPr>
-      </w:pPr>
-      <w:r>
-        <w:rPr>
-          <w:sz w:val="28"/>
-          <w:szCs w:val="28"/>
-          <w:lang w:val="en-US"/>
-        </w:rPr>
-        <w:t xml:space="preserve">  "</w:t>
-      </w:r>
-      <w:proofErr w:type="spellStart"/>
-      <w:r>
-        <w:rPr>
-          <w:sz w:val="28"/>
-          <w:szCs w:val="28"/>
-          <w:lang w:val="en-US"/>
-        </w:rPr>
-        <w:t>reportId</w:t>
-      </w:r>
-      <w:proofErr w:type="spellEnd"/>
-      <w:r>
-        <w:rPr>
-          <w:sz w:val="28"/>
-          <w:szCs w:val="28"/>
-          <w:lang w:val="en-US"/>
-        </w:rPr>
-        <w:t>": "R401",</w:t>
-      </w:r>
-    </w:p>
-    <w:p>
-      <w:pPr>
-        <w:rPr>
-          <w:sz w:val="28"/>
-          <w:szCs w:val="28"/>
-          <w:lang w:val="en-US"/>
-        </w:rPr>
-      </w:pPr>
-      <w:r>
-        <w:rPr>
-          <w:sz w:val="28"/>
-          <w:szCs w:val="28"/>
-          <w:lang w:val="en-US"/>
-        </w:rPr>
-        <w:t xml:space="preserve">  "</w:t>
-      </w:r>
-      <w:proofErr w:type="spellStart"/>
-      <w:r>
-        <w:rPr>
-          <w:sz w:val="28"/>
-          <w:szCs w:val="28"/>
-          <w:lang w:val="en-US"/>
-        </w:rPr>
-        <w:t>patientId</w:t>
-      </w:r>
-      <w:proofErr w:type="spellEnd"/>
-      <w:r>
-        <w:rPr>
-          <w:sz w:val="28"/>
-          <w:szCs w:val="28"/>
-          <w:lang w:val="en-US"/>
-        </w:rPr>
-        <w:t>": "P101",</w:t>
-      </w:r>
-    </w:p>
-    <w:p>
-      <w:pPr>
-        <w:rPr>
-          <w:sz w:val="28"/>
-          <w:szCs w:val="28"/>
-          <w:lang w:val="en-US"/>
-        </w:rPr>
-      </w:pPr>
-      <w:r>
-        <w:rPr>
-          <w:sz w:val="28"/>
-          <w:szCs w:val="28"/>
-          <w:lang w:val="en-US"/>
-        </w:rPr>
-        <w:t xml:space="preserve">  "</w:t>
-      </w:r>
-      <w:proofErr w:type="spellStart"/>
-      <w:r>
-        <w:rPr>
-          <w:sz w:val="28"/>
-          <w:szCs w:val="28"/>
-          <w:lang w:val="en-US"/>
-        </w:rPr>
-        <w:t>reportName</w:t>
-      </w:r>
-      <w:proofErr w:type="spellEnd"/>
-      <w:r>
-        <w:rPr>
-          <w:sz w:val="28"/>
-          <w:szCs w:val="28"/>
-          <w:lang w:val="en-US"/>
-        </w:rPr>
-        <w:t>": "Blood Test",</w:t>
-      </w:r>
-    </w:p>
-    <w:p>
-      <w:pPr>
-        <w:rPr>
-          <w:sz w:val="28"/>
-          <w:szCs w:val="28"/>
-          <w:lang w:val="en-US"/>
-        </w:rPr>
-      </w:pPr>
-      <w:r>
-        <w:rPr>
-          <w:sz w:val="28"/>
-          <w:szCs w:val="28"/>
-          <w:lang w:val="en-US"/>
-        </w:rPr>
-        <w:t xml:space="preserve">  "</w:t>
-      </w:r>
-      <w:proofErr w:type="spellStart"/>
-      <w:r>
-        <w:rPr>
-          <w:sz w:val="28"/>
-          <w:szCs w:val="28"/>
-          <w:lang w:val="en-US"/>
-        </w:rPr>
-        <w:t>fileUrl</w:t>
-      </w:r>
-      <w:proofErr w:type="spellEnd"/>
-      <w:r>
-        <w:rPr>
-          <w:sz w:val="28"/>
-          <w:szCs w:val="28"/>
-          <w:lang w:val="en-US"/>
-        </w:rPr>
-        <w:t>": "/uploads/bloodtest.pdf",</w:t>
-      </w:r>
-    </w:p>
-    <w:p>
-      <w:pPr>
-        <w:rPr>
-          <w:sz w:val="28"/>
-          <w:szCs w:val="28"/>
-          <w:lang w:val="en-US"/>
-        </w:rPr>
-      </w:pPr>
-      <w:r>
-        <w:rPr>
-          <w:sz w:val="28"/>
-          <w:szCs w:val="28"/>
-          <w:lang w:val="en-US"/>
-        </w:rPr>
-        <w:t xml:space="preserve">  "</w:t>
-      </w:r>
-      <w:proofErr w:type="spellStart"/>
-      <w:r>
-        <w:rPr>
-          <w:sz w:val="28"/>
-          <w:szCs w:val="28"/>
-          <w:lang w:val="en-US"/>
-        </w:rPr>
-        <w:t>uploadedBy</w:t>
-      </w:r>
-      <w:proofErr w:type="spellEnd"/>
-      <w:r>
-        <w:rPr>
-          <w:sz w:val="28"/>
-          <w:szCs w:val="28"/>
-          <w:lang w:val="en-US"/>
-        </w:rPr>
-        <w:t>": "Doctor",</w:t>
-      </w:r>
-    </w:p>
-    <w:p>
-      <w:pPr>
-        <w:rPr>
-          <w:sz w:val="28"/>
-          <w:szCs w:val="28"/>
-          <w:lang w:val="en-US"/>
-        </w:rPr>
-      </w:pPr>
-      <w:r>
-        <w:rPr>
-          <w:sz w:val="28"/>
-          <w:szCs w:val="28"/>
-          <w:lang w:val="en-US"/>
-        </w:rPr>
-        <w:t xml:space="preserve">  "</w:t>
-      </w:r>
-      <w:proofErr w:type="spellStart"/>
-      <w:r>
-        <w:rPr>
-          <w:sz w:val="28"/>
-          <w:szCs w:val="28"/>
-          <w:lang w:val="en-US"/>
-        </w:rPr>
-        <w:t>uploadedAt</w:t>
-      </w:r>
-      <w:proofErr w:type="spellEnd"/>
-      <w:r>
-        <w:rPr>
-          <w:sz w:val="28"/>
-          <w:szCs w:val="28"/>
-          <w:lang w:val="en-US"/>
-        </w:rPr>
-        <w:t>": "2026-07-04"</w:t>
-      </w:r>
-    </w:p>
-    <w:p>
-      <w:pPr>
-        <w:rPr>
-          <w:sz w:val="28"/>
-          <w:szCs w:val="28"/>
-          <w:lang w:val="en-US"/>
-        </w:rPr>
-      </w:pPr>
-      <w:r>
-        <w:rPr>
-          <w:sz w:val="28"/>
-          <w:szCs w:val="28"/>
-          <w:lang w:val="en-US"/>
-        </w:rPr>
-        <w:t>}</w:t>
-      </w:r>
-    </w:p>
-    <w:p>
-      <w:pPr>
-        <w:rPr>
-          <w:sz w:val="28"/>
-          <w:szCs w:val="28"/>
-          <w:lang w:val="en-US"/>
-        </w:rPr>
-      </w:pPr>
-    </w:p>
-    <w:p>
-      <w:pPr>
-        <w:rPr>
-          <w:sz w:val="28"/>
-          <w:szCs w:val="28"/>
-          <w:lang w:val="en-US"/>
-        </w:rPr>
-      </w:pPr>
-      <w:r>
-        <w:rPr>
-          <w:sz w:val="28"/>
-          <w:szCs w:val="28"/>
-          <w:lang w:val="en-US"/>
-        </w:rPr>
-        <w:t>Admin collection-</w:t>
-      </w:r>
-      <w:r>
-        <w:rPr>
-          <w:sz w:val="28"/>
-          <w:szCs w:val="28"/>
-          <w:lang w:val="en-US"/>
+      <w:r>
+        <w:rPr>
+          <w:sz w:val="28"/>
+          <w:szCs w:val="28"/>
         </w:rPr>
         <w:br/>
-      </w:r>
-      <w:r>
-        <w:rPr>
-          <w:sz w:val="28"/>
-          <w:szCs w:val="28"/>
-        </w:rPr>
-        <w:t>{</w:t>
-      </w:r>
-      <w:r>
-        <w:rPr>
-          <w:sz w:val="28"/>
-          <w:szCs w:val="28"/>
-        </w:rPr>
-        <w:br/>
-        <w:t>"</w:t>
-      </w:r>
-      <w:proofErr w:type="spellStart"/>
-      <w:r>
-        <w:rPr>
-          <w:sz w:val="28"/>
-          <w:szCs w:val="28"/>
-        </w:rPr>
-        <w:t>adminId</w:t>
-      </w:r>
-      <w:proofErr w:type="spellEnd"/>
-      <w:r>
-        <w:rPr>
-          <w:sz w:val="28"/>
-          <w:szCs w:val="28"/>
-        </w:rPr>
-        <w:t>": "ADM001",</w:t>
       </w:r>
       <w:r>
         <w:rPr>
@@ -5824,7 +5013,37 @@
           <w:szCs w:val="28"/>
         </w:rPr>
         <w:br/>
-        <w:t>"password": "$2b$10$...",</w:t>
+        <w:t>"role": "Admin"</w:t>
+      </w:r>
+    </w:p>
+    <w:p>
+      <w:pPr>
+        <w:rPr>
+          <w:sz w:val="28"/>
+          <w:szCs w:val="28"/>
+        </w:rPr>
+      </w:pPr>
+      <w:r>
+        <w:rPr>
+          <w:sz w:val="28"/>
+          <w:szCs w:val="28"/>
+        </w:rPr>
+        <w:t>“contact”:</w:t>
+      </w:r>
+    </w:p>
+    <w:p>
+      <w:pPr>
+        <w:rPr>
+          <w:sz w:val="28"/>
+          <w:szCs w:val="28"/>
+        </w:rPr>
+      </w:pPr>
+      <w:r>
+        <w:rPr>
+          <w:sz w:val="28"/>
+          <w:szCs w:val="28"/>
+        </w:rPr>
+        <w:t>Address:</w:t>
       </w:r>
       <w:r>
         <w:rPr>
@@ -5832,14 +5051,142 @@
           <w:szCs w:val="28"/>
         </w:rPr>
         <w:br/>
-        <w:t>"role": "Admin"</w:t>
-      </w:r>
-      <w:r>
-        <w:rPr>
-          <w:sz w:val="28"/>
-          <w:szCs w:val="28"/>
-        </w:rPr>
-        <w:br/>
+        <w:t>}</w:t>
+      </w:r>
+    </w:p>
+    <w:p>
+      <w:pPr>
+        <w:rPr>
+          <w:sz w:val="28"/>
+          <w:szCs w:val="28"/>
+        </w:rPr>
+      </w:pPr>
+    </w:p>
+    <w:p>
+      <w:pPr>
+        <w:rPr>
+          <w:sz w:val="28"/>
+          <w:szCs w:val="28"/>
+        </w:rPr>
+      </w:pPr>
+    </w:p>
+    <w:p>
+      <w:pPr>
+        <w:rPr>
+          <w:sz w:val="28"/>
+          <w:szCs w:val="28"/>
+        </w:rPr>
+      </w:pPr>
+      <w:r>
+        <w:rPr>
+          <w:sz w:val="28"/>
+          <w:szCs w:val="28"/>
+        </w:rPr>
+        <w:t>Login Collection-</w:t>
+      </w:r>
+    </w:p>
+    <w:p>
+      <w:pPr>
+        <w:rPr>
+          <w:sz w:val="28"/>
+          <w:szCs w:val="28"/>
+        </w:rPr>
+      </w:pPr>
+      <w:r>
+        <w:rPr>
+          <w:sz w:val="28"/>
+          <w:szCs w:val="28"/>
+        </w:rPr>
+        <w:t>{</w:t>
+      </w:r>
+    </w:p>
+    <w:p>
+      <w:pPr>
+        <w:rPr>
+          <w:sz w:val="28"/>
+          <w:szCs w:val="28"/>
+        </w:rPr>
+      </w:pPr>
+      <w:r>
+        <w:rPr>
+          <w:sz w:val="28"/>
+          <w:szCs w:val="28"/>
+        </w:rPr>
+        <w:tab/>
+        <w:t>Email:”</w:t>
+      </w:r>
+      <w:hyperlink r:id="rId7" w:history="1">
+        <w:r>
+          <w:rPr>
+            <w:rStyle w:val="Hyperlink"/>
+            <w:sz w:val="28"/>
+            <w:szCs w:val="28"/>
+          </w:rPr>
+          <w:t>vaibhradhe@gmail.com</w:t>
+        </w:r>
+      </w:hyperlink>
+      <w:r>
+        <w:rPr>
+          <w:sz w:val="28"/>
+          <w:szCs w:val="28"/>
+        </w:rPr>
+        <w:t>”,</w:t>
+      </w:r>
+    </w:p>
+    <w:p>
+      <w:pPr>
+        <w:rPr>
+          <w:sz w:val="28"/>
+          <w:szCs w:val="28"/>
+        </w:rPr>
+      </w:pPr>
+      <w:r>
+        <w:rPr>
+          <w:sz w:val="28"/>
+          <w:szCs w:val="28"/>
+        </w:rPr>
+        <w:tab/>
+        <w:t>Password:”45684ghhv”</w:t>
+      </w:r>
+    </w:p>
+    <w:p>
+      <w:pPr>
+        <w:rPr>
+          <w:sz w:val="28"/>
+          <w:szCs w:val="28"/>
+        </w:rPr>
+      </w:pPr>
+      <w:r>
+        <w:rPr>
+          <w:sz w:val="28"/>
+          <w:szCs w:val="28"/>
+        </w:rPr>
+        <w:tab/>
+        <w:t>Role:”patient”</w:t>
+      </w:r>
+    </w:p>
+    <w:p>
+      <w:pPr>
+        <w:rPr>
+          <w:sz w:val="28"/>
+          <w:szCs w:val="28"/>
+        </w:rPr>
+      </w:pPr>
+    </w:p>
+    <w:p>
+      <w:pPr>
+        <w:rPr>
+          <w:sz w:val="28"/>
+          <w:szCs w:val="28"/>
+          <w:lang w:val="en-US"/>
+        </w:rPr>
+      </w:pPr>
+      <w:r>
+        <w:rPr>
+          <w:sz w:val="28"/>
+          <w:szCs w:val="28"/>
+          <w:lang w:val="en-US"/>
+        </w:rPr>
         <w:t>}</w:t>
       </w:r>
     </w:p>
@@ -6163,67 +5510,7 @@
           <w:sz w:val="28"/>
           <w:szCs w:val="28"/>
         </w:rPr>
-        <w:t xml:space="preserve">The </w:t>
-      </w:r>
-      <w:proofErr w:type="spellStart"/>
-      <w:r>
-        <w:rPr>
-          <w:b/>
-          <w:bCs/>
-          <w:sz w:val="28"/>
-          <w:szCs w:val="28"/>
-        </w:rPr>
-        <w:t>AstraCare</w:t>
-      </w:r>
-      <w:proofErr w:type="spellEnd"/>
-      <w:r>
-        <w:rPr>
-          <w:b/>
-          <w:bCs/>
-          <w:sz w:val="28"/>
-          <w:szCs w:val="28"/>
-        </w:rPr>
-        <w:t xml:space="preserve"> Hospital Management System uses MongoDB as its database to store and manage hospital-related data. The system follows a collection-based structure where each collection represents a specific entity such as users, patients, doctors, appointments, and reports. Relationships between entities are managed using unique identifiers such as </w:t>
-      </w:r>
-      <w:proofErr w:type="spellStart"/>
-      <w:r>
-        <w:rPr>
-          <w:b/>
-          <w:bCs/>
-          <w:sz w:val="28"/>
-          <w:szCs w:val="28"/>
-        </w:rPr>
-        <w:t>patientId</w:t>
-      </w:r>
-      <w:proofErr w:type="spellEnd"/>
-      <w:r>
-        <w:rPr>
-          <w:b/>
-          <w:bCs/>
-          <w:sz w:val="28"/>
-          <w:szCs w:val="28"/>
-        </w:rPr>
-        <w:t xml:space="preserve"> and </w:t>
-      </w:r>
-      <w:proofErr w:type="spellStart"/>
-      <w:r>
-        <w:rPr>
-          <w:b/>
-          <w:bCs/>
-          <w:sz w:val="28"/>
-          <w:szCs w:val="28"/>
-        </w:rPr>
-        <w:t>doctorId</w:t>
-      </w:r>
-      <w:proofErr w:type="spellEnd"/>
-      <w:r>
-        <w:rPr>
-          <w:b/>
-          <w:bCs/>
-          <w:sz w:val="28"/>
-          <w:szCs w:val="28"/>
-        </w:rPr>
-        <w:t>.</w:t>
+        <w:t>The AstraCare Hospital Management System uses MongoDB as its database to store and manage hospital-related data. The system follows a collection-based structure where each collection represents a specific entity such as users, patients, doctors, appointments, and reports. Relationships between entities are managed using unique identifiers such as patientId and doctorId.</w:t>
       </w:r>
     </w:p>
     <w:p>
@@ -6296,9 +5583,11 @@
         <w:rPr>
           <w:b/>
           <w:bCs/>
-          <w:sz w:val="28"/>
-          <w:szCs w:val="28"/>
-        </w:rPr>
+          <w:noProof/>
+          <w:sz w:val="28"/>
+          <w:szCs w:val="28"/>
+        </w:rPr>
+        <w:lastRenderedPageBreak/>
         <w:drawing>
           <wp:inline distT="0" distB="0" distL="0" distR="0" wp14:anchorId="2DE4C153" wp14:editId="3BD9632C">
             <wp:extent cx="3375953" cy="5342083"/>
@@ -6315,7 +5604,7 @@
                     <pic:cNvPicPr/>
                   </pic:nvPicPr>
                   <pic:blipFill>
-                    <a:blip r:embed="rId7"/>
+                    <a:blip r:embed="rId8"/>
                     <a:stretch>
                       <a:fillRect/>
                     </a:stretch>
@@ -6486,7 +5775,6 @@
           <w:sz w:val="28"/>
           <w:szCs w:val="28"/>
         </w:rPr>
-        <w:lastRenderedPageBreak/>
         <w:t xml:space="preserve">Pharmacy module </w:t>
       </w:r>
     </w:p>
@@ -6506,6 +5794,7 @@
           <w:sz w:val="28"/>
           <w:szCs w:val="28"/>
         </w:rPr>
+        <w:lastRenderedPageBreak/>
         <w:t>Duty chart (tabular)</w:t>
       </w:r>
     </w:p>
@@ -6517,6 +5806,480 @@
           <w:szCs w:val="28"/>
         </w:rPr>
       </w:pPr>
+    </w:p>
+    <w:p>
+      <w:pPr>
+        <w:ind w:left="720"/>
+        <w:rPr>
+          <w:sz w:val="28"/>
+          <w:szCs w:val="28"/>
+        </w:rPr>
+      </w:pPr>
+      <w:r>
+        <w:rPr>
+          <w:sz w:val="28"/>
+          <w:szCs w:val="28"/>
+        </w:rPr>
+        <w:t>## appointment workflow</w:t>
+      </w:r>
+    </w:p>
+    <w:p>
+      <w:pPr>
+        <w:ind w:left="720"/>
+        <w:rPr>
+          <w:sz w:val="28"/>
+          <w:szCs w:val="28"/>
+        </w:rPr>
+      </w:pPr>
+    </w:p>
+    <w:p>
+      <w:pPr>
+        <w:ind w:left="720"/>
+        <w:rPr>
+          <w:sz w:val="28"/>
+          <w:szCs w:val="28"/>
+        </w:rPr>
+      </w:pPr>
+      <w:r>
+        <w:rPr>
+          <w:sz w:val="28"/>
+          <w:szCs w:val="28"/>
+        </w:rPr>
+        <w:t>Patient</w:t>
+      </w:r>
+    </w:p>
+    <w:p>
+      <w:pPr>
+        <w:ind w:left="720"/>
+        <w:rPr>
+          <w:sz w:val="28"/>
+          <w:szCs w:val="28"/>
+        </w:rPr>
+      </w:pPr>
+    </w:p>
+    <w:p>
+      <w:pPr>
+        <w:ind w:left="720"/>
+        <w:rPr>
+          <w:sz w:val="28"/>
+          <w:szCs w:val="28"/>
+        </w:rPr>
+      </w:pPr>
+      <w:r>
+        <w:rPr>
+          <w:sz w:val="28"/>
+          <w:szCs w:val="28"/>
+        </w:rPr>
+        <w:t>↓</w:t>
+      </w:r>
+    </w:p>
+    <w:p>
+      <w:pPr>
+        <w:ind w:left="720"/>
+        <w:rPr>
+          <w:sz w:val="28"/>
+          <w:szCs w:val="28"/>
+        </w:rPr>
+      </w:pPr>
+    </w:p>
+    <w:p>
+      <w:pPr>
+        <w:ind w:left="720"/>
+        <w:rPr>
+          <w:sz w:val="28"/>
+          <w:szCs w:val="28"/>
+        </w:rPr>
+      </w:pPr>
+      <w:r>
+        <w:rPr>
+          <w:sz w:val="28"/>
+          <w:szCs w:val="28"/>
+        </w:rPr>
+        <w:t>Choose Department</w:t>
+      </w:r>
+    </w:p>
+    <w:p>
+      <w:pPr>
+        <w:ind w:left="720"/>
+        <w:rPr>
+          <w:sz w:val="28"/>
+          <w:szCs w:val="28"/>
+        </w:rPr>
+      </w:pPr>
+    </w:p>
+    <w:p>
+      <w:pPr>
+        <w:ind w:left="720"/>
+        <w:rPr>
+          <w:sz w:val="28"/>
+          <w:szCs w:val="28"/>
+        </w:rPr>
+      </w:pPr>
+      <w:r>
+        <w:rPr>
+          <w:sz w:val="28"/>
+          <w:szCs w:val="28"/>
+        </w:rPr>
+        <w:t>↓</w:t>
+      </w:r>
+    </w:p>
+    <w:p>
+      <w:pPr>
+        <w:ind w:left="720"/>
+        <w:rPr>
+          <w:sz w:val="28"/>
+          <w:szCs w:val="28"/>
+        </w:rPr>
+      </w:pPr>
+    </w:p>
+    <w:p>
+      <w:pPr>
+        <w:ind w:left="720"/>
+        <w:rPr>
+          <w:sz w:val="28"/>
+          <w:szCs w:val="28"/>
+        </w:rPr>
+      </w:pPr>
+      <w:r>
+        <w:rPr>
+          <w:sz w:val="28"/>
+          <w:szCs w:val="28"/>
+        </w:rPr>
+        <w:t>Find Doctors</w:t>
+      </w:r>
+    </w:p>
+    <w:p>
+      <w:pPr>
+        <w:ind w:left="720"/>
+        <w:rPr>
+          <w:sz w:val="28"/>
+          <w:szCs w:val="28"/>
+        </w:rPr>
+      </w:pPr>
+      <w:r>
+        <w:rPr>
+          <w:sz w:val="28"/>
+          <w:szCs w:val="28"/>
+        </w:rPr>
+        <w:t>(Doctor collection)</w:t>
+      </w:r>
+    </w:p>
+    <w:p>
+      <w:pPr>
+        <w:ind w:left="720"/>
+        <w:rPr>
+          <w:sz w:val="28"/>
+          <w:szCs w:val="28"/>
+        </w:rPr>
+      </w:pPr>
+    </w:p>
+    <w:p>
+      <w:pPr>
+        <w:ind w:left="720"/>
+        <w:rPr>
+          <w:sz w:val="28"/>
+          <w:szCs w:val="28"/>
+        </w:rPr>
+      </w:pPr>
+      <w:r>
+        <w:rPr>
+          <w:sz w:val="28"/>
+          <w:szCs w:val="28"/>
+        </w:rPr>
+        <w:t>↓</w:t>
+      </w:r>
+    </w:p>
+    <w:p>
+      <w:pPr>
+        <w:ind w:left="720"/>
+        <w:rPr>
+          <w:sz w:val="28"/>
+          <w:szCs w:val="28"/>
+        </w:rPr>
+      </w:pPr>
+    </w:p>
+    <w:p>
+      <w:pPr>
+        <w:ind w:left="720"/>
+        <w:rPr>
+          <w:sz w:val="28"/>
+          <w:szCs w:val="28"/>
+        </w:rPr>
+      </w:pPr>
+      <w:r>
+        <w:rPr>
+          <w:sz w:val="28"/>
+          <w:szCs w:val="28"/>
+        </w:rPr>
+        <w:t>Choose Doctor</w:t>
+      </w:r>
+    </w:p>
+    <w:p>
+      <w:pPr>
+        <w:ind w:left="720"/>
+        <w:rPr>
+          <w:sz w:val="28"/>
+          <w:szCs w:val="28"/>
+        </w:rPr>
+      </w:pPr>
+    </w:p>
+    <w:p>
+      <w:pPr>
+        <w:ind w:left="720"/>
+        <w:rPr>
+          <w:sz w:val="28"/>
+          <w:szCs w:val="28"/>
+        </w:rPr>
+      </w:pPr>
+      <w:r>
+        <w:rPr>
+          <w:sz w:val="28"/>
+          <w:szCs w:val="28"/>
+        </w:rPr>
+        <w:t>↓</w:t>
+      </w:r>
+    </w:p>
+    <w:p>
+      <w:pPr>
+        <w:ind w:left="720"/>
+        <w:rPr>
+          <w:sz w:val="28"/>
+          <w:szCs w:val="28"/>
+        </w:rPr>
+      </w:pPr>
+    </w:p>
+    <w:p>
+      <w:pPr>
+        <w:ind w:left="720"/>
+        <w:rPr>
+          <w:sz w:val="28"/>
+          <w:szCs w:val="28"/>
+        </w:rPr>
+      </w:pPr>
+      <w:r>
+        <w:rPr>
+          <w:sz w:val="28"/>
+          <w:szCs w:val="28"/>
+        </w:rPr>
+        <w:t>Choose Date</w:t>
+      </w:r>
+    </w:p>
+    <w:p>
+      <w:pPr>
+        <w:ind w:left="720"/>
+        <w:rPr>
+          <w:sz w:val="28"/>
+          <w:szCs w:val="28"/>
+        </w:rPr>
+      </w:pPr>
+    </w:p>
+    <w:p>
+      <w:pPr>
+        <w:ind w:left="720"/>
+        <w:rPr>
+          <w:sz w:val="28"/>
+          <w:szCs w:val="28"/>
+        </w:rPr>
+      </w:pPr>
+      <w:r>
+        <w:rPr>
+          <w:sz w:val="28"/>
+          <w:szCs w:val="28"/>
+        </w:rPr>
+        <w:t>↓</w:t>
+      </w:r>
+    </w:p>
+    <w:p>
+      <w:pPr>
+        <w:ind w:left="720"/>
+        <w:rPr>
+          <w:sz w:val="28"/>
+          <w:szCs w:val="28"/>
+        </w:rPr>
+      </w:pPr>
+    </w:p>
+    <w:p>
+      <w:pPr>
+        <w:ind w:left="720"/>
+        <w:rPr>
+          <w:sz w:val="28"/>
+          <w:szCs w:val="28"/>
+        </w:rPr>
+      </w:pPr>
+      <w:r>
+        <w:rPr>
+          <w:sz w:val="28"/>
+          <w:szCs w:val="28"/>
+        </w:rPr>
+        <w:t>Find Shift</w:t>
+      </w:r>
+    </w:p>
+    <w:p>
+      <w:pPr>
+        <w:ind w:left="720"/>
+        <w:rPr>
+          <w:sz w:val="28"/>
+          <w:szCs w:val="28"/>
+        </w:rPr>
+      </w:pPr>
+      <w:r>
+        <w:rPr>
+          <w:sz w:val="28"/>
+          <w:szCs w:val="28"/>
+        </w:rPr>
+        <w:lastRenderedPageBreak/>
+        <w:t>(Shift collection)</w:t>
+      </w:r>
+    </w:p>
+    <w:p>
+      <w:pPr>
+        <w:ind w:left="720"/>
+        <w:rPr>
+          <w:sz w:val="28"/>
+          <w:szCs w:val="28"/>
+        </w:rPr>
+      </w:pPr>
+    </w:p>
+    <w:p>
+      <w:pPr>
+        <w:ind w:left="720"/>
+        <w:rPr>
+          <w:sz w:val="28"/>
+          <w:szCs w:val="28"/>
+        </w:rPr>
+      </w:pPr>
+      <w:r>
+        <w:rPr>
+          <w:sz w:val="28"/>
+          <w:szCs w:val="28"/>
+        </w:rPr>
+        <w:t>↓</w:t>
+      </w:r>
+    </w:p>
+    <w:p>
+      <w:pPr>
+        <w:ind w:left="720"/>
+        <w:rPr>
+          <w:sz w:val="28"/>
+          <w:szCs w:val="28"/>
+        </w:rPr>
+      </w:pPr>
+    </w:p>
+    <w:p>
+      <w:pPr>
+        <w:ind w:left="720"/>
+        <w:rPr>
+          <w:sz w:val="28"/>
+          <w:szCs w:val="28"/>
+        </w:rPr>
+      </w:pPr>
+      <w:r>
+        <w:rPr>
+          <w:sz w:val="28"/>
+          <w:szCs w:val="28"/>
+        </w:rPr>
+        <w:t>Generate Available Slots</w:t>
+      </w:r>
+    </w:p>
+    <w:p>
+      <w:pPr>
+        <w:ind w:left="720"/>
+        <w:rPr>
+          <w:sz w:val="28"/>
+          <w:szCs w:val="28"/>
+        </w:rPr>
+      </w:pPr>
+    </w:p>
+    <w:p>
+      <w:pPr>
+        <w:ind w:left="720"/>
+        <w:rPr>
+          <w:sz w:val="28"/>
+          <w:szCs w:val="28"/>
+        </w:rPr>
+      </w:pPr>
+      <w:r>
+        <w:rPr>
+          <w:sz w:val="28"/>
+          <w:szCs w:val="28"/>
+        </w:rPr>
+        <w:t>↓</w:t>
+      </w:r>
+    </w:p>
+    <w:p>
+      <w:pPr>
+        <w:ind w:left="720"/>
+        <w:rPr>
+          <w:sz w:val="28"/>
+          <w:szCs w:val="28"/>
+        </w:rPr>
+      </w:pPr>
+    </w:p>
+    <w:p>
+      <w:pPr>
+        <w:ind w:left="720"/>
+        <w:rPr>
+          <w:sz w:val="28"/>
+          <w:szCs w:val="28"/>
+        </w:rPr>
+      </w:pPr>
+      <w:r>
+        <w:rPr>
+          <w:sz w:val="28"/>
+          <w:szCs w:val="28"/>
+        </w:rPr>
+        <w:t>Book Appointment</w:t>
+      </w:r>
+    </w:p>
+    <w:p>
+      <w:pPr>
+        <w:ind w:left="720"/>
+        <w:rPr>
+          <w:sz w:val="28"/>
+          <w:szCs w:val="28"/>
+        </w:rPr>
+      </w:pPr>
+    </w:p>
+    <w:p>
+      <w:pPr>
+        <w:ind w:left="720"/>
+        <w:rPr>
+          <w:sz w:val="28"/>
+          <w:szCs w:val="28"/>
+        </w:rPr>
+      </w:pPr>
+      <w:r>
+        <w:rPr>
+          <w:sz w:val="28"/>
+          <w:szCs w:val="28"/>
+        </w:rPr>
+        <w:t>↓</w:t>
+      </w:r>
+    </w:p>
+    <w:p>
+      <w:pPr>
+        <w:ind w:left="720"/>
+        <w:rPr>
+          <w:sz w:val="28"/>
+          <w:szCs w:val="28"/>
+        </w:rPr>
+      </w:pPr>
+    </w:p>
+    <w:p>
+      <w:pPr>
+        <w:ind w:left="720"/>
+        <w:rPr>
+          <w:sz w:val="28"/>
+          <w:szCs w:val="28"/>
+        </w:rPr>
+      </w:pPr>
+      <w:r>
+        <w:rPr>
+          <w:sz w:val="28"/>
+          <w:szCs w:val="28"/>
+        </w:rPr>
+        <w:t>Appointment Collection</w:t>
+      </w:r>
     </w:p>
     <w:p>
       <w:pPr>
@@ -6596,10 +6359,17 @@
           <w:lang w:eastAsia="en-IN"/>
           <w14:ligatures w14:val="none"/>
         </w:rPr>
-        <w:t xml:space="preserve">The </w:t>
-      </w:r>
-      <w:proofErr w:type="spellStart"/>
-      <w:r>
+        <w:t>The AstraCare Hospital Management System is a comprehensive web-based solution designed to modernize and streamline hospital operations using the MERN stack. The system successfully addresses key challenges in traditional hospital management such as manual record keeping, communication gaps, and operational inefficiencies.</w:t>
+      </w:r>
+    </w:p>
+    <w:p>
+      <w:pPr>
+        <w:pStyle w:val="ListParagraph"/>
+        <w:numPr>
+          <w:ilvl w:val="0"/>
+          <w:numId w:val="30"/>
+        </w:numPr>
+        <w:spacing w:before="100" w:beforeAutospacing="1" w:after="100" w:afterAutospacing="1" w:line="240" w:lineRule="auto"/>
         <w:rPr>
           <w:rFonts w:ascii="Times New Roman" w:eastAsia="Times New Roman" w:hAnsi="Times New Roman" w:cs="Times New Roman"/>
           <w:kern w:val="0"/>
@@ -6608,9 +6378,7 @@
           <w:lang w:eastAsia="en-IN"/>
           <w14:ligatures w14:val="none"/>
         </w:rPr>
-        <w:t>AstraCare</w:t>
-      </w:r>
-      <w:proofErr w:type="spellEnd"/>
+      </w:pPr>
       <w:r>
         <w:rPr>
           <w:rFonts w:ascii="Times New Roman" w:eastAsia="Times New Roman" w:hAnsi="Times New Roman" w:cs="Times New Roman"/>
@@ -6620,7 +6388,7 @@
           <w:lang w:eastAsia="en-IN"/>
           <w14:ligatures w14:val="none"/>
         </w:rPr>
-        <w:t xml:space="preserve"> Hospital Management System is a comprehensive web-based solution designed to modernize and streamline hospital operations using the MERN stack. The system successfully addresses key challenges in traditional hospital management such as manual record keeping, communication gaps, and operational inefficiencies.</w:t>
+        <w:t>By digitizing core functionalities like patient registration, appointment scheduling, diagnosis management, prescription handling, and medical report processing, the system ensures improved accuracy, efficiency, and accessibility of healthcare services.</w:t>
       </w:r>
     </w:p>
     <w:p>
@@ -6649,7 +6417,7 @@
           <w:lang w:eastAsia="en-IN"/>
           <w14:ligatures w14:val="none"/>
         </w:rPr>
-        <w:t>By digitizing core functionalities like patient registration, appointment scheduling, diagnosis management, prescription handling, and medical report processing, the system ensures improved accuracy, efficiency, and accessibility of healthcare services.</w:t>
+        <w:t>The implementation of role-based access control (RBAC), JWT-based authentication, and secure API architecture enhances the security and reliability of sensitive medical data. The system also provides a scalable and flexible structure, allowing future enhancements such as billing systems, AI-based diagnosis support, telemedicine, and automated notifications.</w:t>
       </w:r>
     </w:p>
     <w:p>
@@ -6678,60 +6446,7 @@
           <w:lang w:eastAsia="en-IN"/>
           <w14:ligatures w14:val="none"/>
         </w:rPr>
-        <w:t>The implementation of role-based access control (RBAC), JWT-based authentication, and secure API architecture enhances the security and reliability of sensitive medical data. The system also provides a scalable and flexible structure, allowing future enhancements such as billing systems, AI-based diagnosis support, telemedicine, and automated notifications.</w:t>
-      </w:r>
-    </w:p>
-    <w:p>
-      <w:pPr>
-        <w:pStyle w:val="ListParagraph"/>
-        <w:numPr>
-          <w:ilvl w:val="0"/>
-          <w:numId w:val="30"/>
-        </w:numPr>
-        <w:spacing w:before="100" w:beforeAutospacing="1" w:after="100" w:afterAutospacing="1" w:line="240" w:lineRule="auto"/>
-        <w:rPr>
-          <w:rFonts w:ascii="Times New Roman" w:eastAsia="Times New Roman" w:hAnsi="Times New Roman" w:cs="Times New Roman"/>
-          <w:kern w:val="0"/>
-          <w:sz w:val="24"/>
-          <w:szCs w:val="24"/>
-          <w:lang w:eastAsia="en-IN"/>
-          <w14:ligatures w14:val="none"/>
-        </w:rPr>
-      </w:pPr>
-      <w:r>
-        <w:rPr>
-          <w:rFonts w:ascii="Times New Roman" w:eastAsia="Times New Roman" w:hAnsi="Times New Roman" w:cs="Times New Roman"/>
-          <w:kern w:val="0"/>
-          <w:sz w:val="24"/>
-          <w:szCs w:val="24"/>
-          <w:lang w:eastAsia="en-IN"/>
-          <w14:ligatures w14:val="none"/>
-        </w:rPr>
-        <w:t xml:space="preserve">Overall, the </w:t>
-      </w:r>
-      <w:proofErr w:type="spellStart"/>
-      <w:r>
-        <w:rPr>
-          <w:rFonts w:ascii="Times New Roman" w:eastAsia="Times New Roman" w:hAnsi="Times New Roman" w:cs="Times New Roman"/>
-          <w:kern w:val="0"/>
-          <w:sz w:val="24"/>
-          <w:szCs w:val="24"/>
-          <w:lang w:eastAsia="en-IN"/>
-          <w14:ligatures w14:val="none"/>
-        </w:rPr>
-        <w:t>AstraCare</w:t>
-      </w:r>
-      <w:proofErr w:type="spellEnd"/>
-      <w:r>
-        <w:rPr>
-          <w:rFonts w:ascii="Times New Roman" w:eastAsia="Times New Roman" w:hAnsi="Times New Roman" w:cs="Times New Roman"/>
-          <w:kern w:val="0"/>
-          <w:sz w:val="24"/>
-          <w:szCs w:val="24"/>
-          <w:lang w:eastAsia="en-IN"/>
-          <w14:ligatures w14:val="none"/>
-        </w:rPr>
-        <w:t xml:space="preserve"> Hospital Management System serves as an efficient, scalable, and user-friendly platform that improves coordination between patients, doctors, staff, and administrators, thereby contributing to better healthcare service delivery.</w:t>
+        <w:t>Overall, the AstraCare Hospital Management System serves as an efficient, scalable, and user-friendly platform that improves coordination between patients, doctors, staff, and administrators, thereby contributing to better healthcare service delivery.</w:t>
       </w:r>
     </w:p>
     <w:p>
@@ -12179,6 +11894,29 @@
       <w14:ligatures w14:val="none"/>
     </w:rPr>
   </w:style>
+  <w:style w:type="character" w:styleId="Hyperlink">
+    <w:name w:val="Hyperlink"/>
+    <w:basedOn w:val="DefaultParagraphFont"/>
+    <w:uiPriority w:val="99"/>
+    <w:unhideWhenUsed/>
+    <w:rsid w:val="009201A7"/>
+    <w:rPr>
+      <w:color w:val="0563C1" w:themeColor="hyperlink"/>
+      <w:u w:val="single"/>
+    </w:rPr>
+  </w:style>
+  <w:style w:type="character" w:styleId="UnresolvedMention">
+    <w:name w:val="Unresolved Mention"/>
+    <w:basedOn w:val="DefaultParagraphFont"/>
+    <w:uiPriority w:val="99"/>
+    <w:semiHidden/>
+    <w:unhideWhenUsed/>
+    <w:rsid w:val="009201A7"/>
+    <w:rPr>
+      <w:color w:val="605E5C"/>
+      <w:shd w:val="clear" w:color="auto" w:fill="E1DFDD"/>
+    </w:rPr>
+  </w:style>
 </w:styles>
 </file>
 

</xml_diff>